<commit_message>
Update a little bit
</commit_message>
<xml_diff>
--- a/Project report.docx
+++ b/Project report.docx
@@ -23,6 +23,9 @@
     <w:p>
       <w:pPr>
         <w:jc w:val="center"/>
+        <w:rPr>
+          <w:lang w:val="vi-VN"/>
+        </w:rPr>
       </w:pPr>
       <w:r>
         <w:rPr>
@@ -36,21 +39,18 @@
     </w:p>
     <w:p>
       <w:pPr>
-        <w:spacing w:before="120"/>
-        <w:jc w:val="center"/>
-      </w:pPr>
-      <w:r>
         <w:rPr>
-          <w:b/>
-          <w:bCs/>
-          <w:color w:val="1F4E79"/>
-          <w:sz w:val="24"/>
-          <w:szCs w:val="24"/>
+          <w:lang w:val="vi-VN"/>
         </w:rPr>
-        <w:t>QUẢN LÝ PHẦN MỀM (SOFTWARE MANAGEMENT)</w:t>
-      </w:r>
-    </w:p>
-    <w:p/>
+      </w:pPr>
+    </w:p>
+    <w:p>
+      <w:pPr>
+        <w:rPr>
+          <w:lang w:val="vi-VN"/>
+        </w:rPr>
+      </w:pPr>
+    </w:p>
     <w:p>
       <w:pPr>
         <w:spacing w:before="400"/>
@@ -96,7 +96,13 @@
     <w:p/>
     <w:p/>
     <w:p/>
-    <w:p/>
+    <w:p>
+      <w:pPr>
+        <w:rPr>
+          <w:lang w:val="en-US"/>
+        </w:rPr>
+      </w:pPr>
+    </w:p>
     <w:p/>
     <w:p/>
     <w:p/>
@@ -158,7 +164,7 @@
         <w:spacing w:before="60"/>
         <w:jc w:val="center"/>
         <w:rPr>
-          <w:lang w:val="vi-VN"/>
+          <w:lang w:val="en-US"/>
         </w:rPr>
       </w:pPr>
       <w:r>
@@ -170,6 +176,39 @@
         </w:rPr>
         <w:t>Nguyễn Đức Anh</w:t>
       </w:r>
+    </w:p>
+    <w:p>
+      <w:pPr>
+        <w:spacing w:before="60"/>
+        <w:jc w:val="center"/>
+        <w:rPr>
+          <w:lang w:val="en-US"/>
+        </w:rPr>
+      </w:pPr>
+    </w:p>
+    <w:p>
+      <w:pPr>
+        <w:spacing w:before="60"/>
+        <w:jc w:val="center"/>
+        <w:rPr>
+          <w:lang w:val="en-US"/>
+        </w:rPr>
+      </w:pPr>
+      <w:r>
+        <w:rPr>
+          <w:lang w:val="en-US"/>
+        </w:rPr>
+        <w:t xml:space="preserve">Source code : </w:t>
+      </w:r>
+      <w:hyperlink r:id="rId7" w:history="1">
+        <w:r>
+          <w:rPr>
+            <w:rStyle w:val="Hyperlink"/>
+            <w:lang w:val="en-US"/>
+          </w:rPr>
+          <w:t>https://github.com/trnchthnh1301z/Graduation-Research-2</w:t>
+        </w:r>
+      </w:hyperlink>
     </w:p>
     <w:p/>
     <w:p/>
@@ -178,6 +217,11 @@
     <w:p/>
     <w:p/>
     <w:p>
+      <w:pPr>
+        <w:rPr>
+          <w:lang w:val="vi-VN"/>
+        </w:rPr>
+      </w:pPr>
       <w:r>
         <w:br w:type="page"/>
       </w:r>
@@ -186,7 +230,7 @@
       <w:pPr>
         <w:pStyle w:val="Heading1"/>
       </w:pPr>
-      <w:bookmarkStart w:id="0" w:name="_Toc232964853"/>
+      <w:bookmarkStart w:id="0" w:name="_Toc233006767"/>
       <w:r>
         <w:lastRenderedPageBreak/>
         <w:t>MỤC LỤC</w:t>
@@ -223,7 +267,7 @@
           <w:r>
             <w:fldChar w:fldCharType="separate"/>
           </w:r>
-          <w:hyperlink w:anchor="_Toc232964853" w:history="1">
+          <w:hyperlink w:anchor="_Toc233006767" w:history="1">
             <w:r>
               <w:rPr>
                 <w:rStyle w:val="Hyperlink"/>
@@ -247,7 +291,7 @@
               <w:rPr>
                 <w:noProof/>
               </w:rPr>
-              <w:instrText xml:space="preserve"> PAGEREF _Toc232964853 \h </w:instrText>
+              <w:instrText xml:space="preserve"> PAGEREF _Toc233006767 \h </w:instrText>
             </w:r>
             <w:r>
               <w:rPr>
@@ -289,7 +333,7 @@
               <w14:ligatures w14:val="standardContextual"/>
             </w:rPr>
           </w:pPr>
-          <w:hyperlink w:anchor="_Toc232964854" w:history="1">
+          <w:hyperlink w:anchor="_Toc233006768" w:history="1">
             <w:r>
               <w:rPr>
                 <w:rStyle w:val="Hyperlink"/>
@@ -313,7 +357,7 @@
               <w:rPr>
                 <w:noProof/>
               </w:rPr>
-              <w:instrText xml:space="preserve"> PAGEREF _Toc232964854 \h </w:instrText>
+              <w:instrText xml:space="preserve"> PAGEREF _Toc233006768 \h </w:instrText>
             </w:r>
             <w:r>
               <w:rPr>
@@ -355,7 +399,7 @@
               <w14:ligatures w14:val="standardContextual"/>
             </w:rPr>
           </w:pPr>
-          <w:hyperlink w:anchor="_Toc232964855" w:history="1">
+          <w:hyperlink w:anchor="_Toc233006769" w:history="1">
             <w:r>
               <w:rPr>
                 <w:rStyle w:val="Hyperlink"/>
@@ -379,7 +423,7 @@
               <w:rPr>
                 <w:noProof/>
               </w:rPr>
-              <w:instrText xml:space="preserve"> PAGEREF _Toc232964855 \h </w:instrText>
+              <w:instrText xml:space="preserve"> PAGEREF _Toc233006769 \h </w:instrText>
             </w:r>
             <w:r>
               <w:rPr>
@@ -421,7 +465,7 @@
               <w14:ligatures w14:val="standardContextual"/>
             </w:rPr>
           </w:pPr>
-          <w:hyperlink w:anchor="_Toc232964856" w:history="1">
+          <w:hyperlink w:anchor="_Toc233006770" w:history="1">
             <w:r>
               <w:rPr>
                 <w:rStyle w:val="Hyperlink"/>
@@ -445,7 +489,7 @@
               <w:rPr>
                 <w:noProof/>
               </w:rPr>
-              <w:instrText xml:space="preserve"> PAGEREF _Toc232964856 \h </w:instrText>
+              <w:instrText xml:space="preserve"> PAGEREF _Toc233006770 \h </w:instrText>
             </w:r>
             <w:r>
               <w:rPr>
@@ -487,7 +531,7 @@
               <w14:ligatures w14:val="standardContextual"/>
             </w:rPr>
           </w:pPr>
-          <w:hyperlink w:anchor="_Toc232964857" w:history="1">
+          <w:hyperlink w:anchor="_Toc233006771" w:history="1">
             <w:r>
               <w:rPr>
                 <w:rStyle w:val="Hyperlink"/>
@@ -511,7 +555,7 @@
               <w:rPr>
                 <w:noProof/>
               </w:rPr>
-              <w:instrText xml:space="preserve"> PAGEREF _Toc232964857 \h </w:instrText>
+              <w:instrText xml:space="preserve"> PAGEREF _Toc233006771 \h </w:instrText>
             </w:r>
             <w:r>
               <w:rPr>
@@ -553,7 +597,7 @@
               <w14:ligatures w14:val="standardContextual"/>
             </w:rPr>
           </w:pPr>
-          <w:hyperlink w:anchor="_Toc232964858" w:history="1">
+          <w:hyperlink w:anchor="_Toc233006772" w:history="1">
             <w:r>
               <w:rPr>
                 <w:rStyle w:val="Hyperlink"/>
@@ -577,7 +621,7 @@
               <w:rPr>
                 <w:noProof/>
               </w:rPr>
-              <w:instrText xml:space="preserve"> PAGEREF _Toc232964858 \h </w:instrText>
+              <w:instrText xml:space="preserve"> PAGEREF _Toc233006772 \h </w:instrText>
             </w:r>
             <w:r>
               <w:rPr>
@@ -619,7 +663,7 @@
               <w14:ligatures w14:val="standardContextual"/>
             </w:rPr>
           </w:pPr>
-          <w:hyperlink w:anchor="_Toc232964859" w:history="1">
+          <w:hyperlink w:anchor="_Toc233006773" w:history="1">
             <w:r>
               <w:rPr>
                 <w:rStyle w:val="Hyperlink"/>
@@ -643,7 +687,7 @@
               <w:rPr>
                 <w:noProof/>
               </w:rPr>
-              <w:instrText xml:space="preserve"> PAGEREF _Toc232964859 \h </w:instrText>
+              <w:instrText xml:space="preserve"> PAGEREF _Toc233006773 \h </w:instrText>
             </w:r>
             <w:r>
               <w:rPr>
@@ -685,7 +729,7 @@
               <w14:ligatures w14:val="standardContextual"/>
             </w:rPr>
           </w:pPr>
-          <w:hyperlink w:anchor="_Toc232964860" w:history="1">
+          <w:hyperlink w:anchor="_Toc233006774" w:history="1">
             <w:r>
               <w:rPr>
                 <w:rStyle w:val="Hyperlink"/>
@@ -709,7 +753,7 @@
               <w:rPr>
                 <w:noProof/>
               </w:rPr>
-              <w:instrText xml:space="preserve"> PAGEREF _Toc232964860 \h </w:instrText>
+              <w:instrText xml:space="preserve"> PAGEREF _Toc233006774 \h </w:instrText>
             </w:r>
             <w:r>
               <w:rPr>
@@ -751,7 +795,7 @@
               <w14:ligatures w14:val="standardContextual"/>
             </w:rPr>
           </w:pPr>
-          <w:hyperlink w:anchor="_Toc232964861" w:history="1">
+          <w:hyperlink w:anchor="_Toc233006775" w:history="1">
             <w:r>
               <w:rPr>
                 <w:rStyle w:val="Hyperlink"/>
@@ -775,7 +819,7 @@
               <w:rPr>
                 <w:noProof/>
               </w:rPr>
-              <w:instrText xml:space="preserve"> PAGEREF _Toc232964861 \h </w:instrText>
+              <w:instrText xml:space="preserve"> PAGEREF _Toc233006775 \h </w:instrText>
             </w:r>
             <w:r>
               <w:rPr>
@@ -817,7 +861,7 @@
               <w14:ligatures w14:val="standardContextual"/>
             </w:rPr>
           </w:pPr>
-          <w:hyperlink w:anchor="_Toc232964862" w:history="1">
+          <w:hyperlink w:anchor="_Toc233006776" w:history="1">
             <w:r>
               <w:rPr>
                 <w:rStyle w:val="Hyperlink"/>
@@ -841,7 +885,7 @@
               <w:rPr>
                 <w:noProof/>
               </w:rPr>
-              <w:instrText xml:space="preserve"> PAGEREF _Toc232964862 \h </w:instrText>
+              <w:instrText xml:space="preserve"> PAGEREF _Toc233006776 \h </w:instrText>
             </w:r>
             <w:r>
               <w:rPr>
@@ -883,7 +927,7 @@
               <w14:ligatures w14:val="standardContextual"/>
             </w:rPr>
           </w:pPr>
-          <w:hyperlink w:anchor="_Toc232964863" w:history="1">
+          <w:hyperlink w:anchor="_Toc233006777" w:history="1">
             <w:r>
               <w:rPr>
                 <w:rStyle w:val="Hyperlink"/>
@@ -907,7 +951,7 @@
               <w:rPr>
                 <w:noProof/>
               </w:rPr>
-              <w:instrText xml:space="preserve"> PAGEREF _Toc232964863 \h </w:instrText>
+              <w:instrText xml:space="preserve"> PAGEREF _Toc233006777 \h </w:instrText>
             </w:r>
             <w:r>
               <w:rPr>
@@ -949,7 +993,7 @@
               <w14:ligatures w14:val="standardContextual"/>
             </w:rPr>
           </w:pPr>
-          <w:hyperlink w:anchor="_Toc232964864" w:history="1">
+          <w:hyperlink w:anchor="_Toc233006778" w:history="1">
             <w:r>
               <w:rPr>
                 <w:rStyle w:val="Hyperlink"/>
@@ -973,7 +1017,7 @@
               <w:rPr>
                 <w:noProof/>
               </w:rPr>
-              <w:instrText xml:space="preserve"> PAGEREF _Toc232964864 \h </w:instrText>
+              <w:instrText xml:space="preserve"> PAGEREF _Toc233006778 \h </w:instrText>
             </w:r>
             <w:r>
               <w:rPr>
@@ -1015,7 +1059,7 @@
               <w14:ligatures w14:val="standardContextual"/>
             </w:rPr>
           </w:pPr>
-          <w:hyperlink w:anchor="_Toc232964865" w:history="1">
+          <w:hyperlink w:anchor="_Toc233006779" w:history="1">
             <w:r>
               <w:rPr>
                 <w:rStyle w:val="Hyperlink"/>
@@ -1039,7 +1083,7 @@
               <w:rPr>
                 <w:noProof/>
               </w:rPr>
-              <w:instrText xml:space="preserve"> PAGEREF _Toc232964865 \h </w:instrText>
+              <w:instrText xml:space="preserve"> PAGEREF _Toc233006779 \h </w:instrText>
             </w:r>
             <w:r>
               <w:rPr>
@@ -1081,7 +1125,7 @@
               <w14:ligatures w14:val="standardContextual"/>
             </w:rPr>
           </w:pPr>
-          <w:hyperlink w:anchor="_Toc232964866" w:history="1">
+          <w:hyperlink w:anchor="_Toc233006780" w:history="1">
             <w:r>
               <w:rPr>
                 <w:rStyle w:val="Hyperlink"/>
@@ -1105,7 +1149,7 @@
               <w:rPr>
                 <w:noProof/>
               </w:rPr>
-              <w:instrText xml:space="preserve"> PAGEREF _Toc232964866 \h </w:instrText>
+              <w:instrText xml:space="preserve"> PAGEREF _Toc233006780 \h </w:instrText>
             </w:r>
             <w:r>
               <w:rPr>
@@ -1147,7 +1191,7 @@
               <w14:ligatures w14:val="standardContextual"/>
             </w:rPr>
           </w:pPr>
-          <w:hyperlink w:anchor="_Toc232964867" w:history="1">
+          <w:hyperlink w:anchor="_Toc233006781" w:history="1">
             <w:r>
               <w:rPr>
                 <w:rStyle w:val="Hyperlink"/>
@@ -1171,7 +1215,7 @@
               <w:rPr>
                 <w:noProof/>
               </w:rPr>
-              <w:instrText xml:space="preserve"> PAGEREF _Toc232964867 \h </w:instrText>
+              <w:instrText xml:space="preserve"> PAGEREF _Toc233006781 \h </w:instrText>
             </w:r>
             <w:r>
               <w:rPr>
@@ -1213,7 +1257,7 @@
               <w14:ligatures w14:val="standardContextual"/>
             </w:rPr>
           </w:pPr>
-          <w:hyperlink w:anchor="_Toc232964868" w:history="1">
+          <w:hyperlink w:anchor="_Toc233006782" w:history="1">
             <w:r>
               <w:rPr>
                 <w:rStyle w:val="Hyperlink"/>
@@ -1237,7 +1281,7 @@
               <w:rPr>
                 <w:noProof/>
               </w:rPr>
-              <w:instrText xml:space="preserve"> PAGEREF _Toc232964868 \h </w:instrText>
+              <w:instrText xml:space="preserve"> PAGEREF _Toc233006782 \h </w:instrText>
             </w:r>
             <w:r>
               <w:rPr>
@@ -1279,7 +1323,7 @@
               <w14:ligatures w14:val="standardContextual"/>
             </w:rPr>
           </w:pPr>
-          <w:hyperlink w:anchor="_Toc232964869" w:history="1">
+          <w:hyperlink w:anchor="_Toc233006783" w:history="1">
             <w:r>
               <w:rPr>
                 <w:rStyle w:val="Hyperlink"/>
@@ -1303,7 +1347,7 @@
               <w:rPr>
                 <w:noProof/>
               </w:rPr>
-              <w:instrText xml:space="preserve"> PAGEREF _Toc232964869 \h </w:instrText>
+              <w:instrText xml:space="preserve"> PAGEREF _Toc233006783 \h </w:instrText>
             </w:r>
             <w:r>
               <w:rPr>
@@ -1345,7 +1389,7 @@
               <w14:ligatures w14:val="standardContextual"/>
             </w:rPr>
           </w:pPr>
-          <w:hyperlink w:anchor="_Toc232964870" w:history="1">
+          <w:hyperlink w:anchor="_Toc233006784" w:history="1">
             <w:r>
               <w:rPr>
                 <w:rStyle w:val="Hyperlink"/>
@@ -1369,7 +1413,7 @@
               <w:rPr>
                 <w:noProof/>
               </w:rPr>
-              <w:instrText xml:space="preserve"> PAGEREF _Toc232964870 \h </w:instrText>
+              <w:instrText xml:space="preserve"> PAGEREF _Toc233006784 \h </w:instrText>
             </w:r>
             <w:r>
               <w:rPr>
@@ -1411,7 +1455,7 @@
               <w14:ligatures w14:val="standardContextual"/>
             </w:rPr>
           </w:pPr>
-          <w:hyperlink w:anchor="_Toc232964871" w:history="1">
+          <w:hyperlink w:anchor="_Toc233006785" w:history="1">
             <w:r>
               <w:rPr>
                 <w:rStyle w:val="Hyperlink"/>
@@ -1435,7 +1479,7 @@
               <w:rPr>
                 <w:noProof/>
               </w:rPr>
-              <w:instrText xml:space="preserve"> PAGEREF _Toc232964871 \h </w:instrText>
+              <w:instrText xml:space="preserve"> PAGEREF _Toc233006785 \h </w:instrText>
             </w:r>
             <w:r>
               <w:rPr>
@@ -1477,7 +1521,7 @@
               <w14:ligatures w14:val="standardContextual"/>
             </w:rPr>
           </w:pPr>
-          <w:hyperlink w:anchor="_Toc232964872" w:history="1">
+          <w:hyperlink w:anchor="_Toc233006786" w:history="1">
             <w:r>
               <w:rPr>
                 <w:rStyle w:val="Hyperlink"/>
@@ -1501,7 +1545,7 @@
               <w:rPr>
                 <w:noProof/>
               </w:rPr>
-              <w:instrText xml:space="preserve"> PAGEREF _Toc232964872 \h </w:instrText>
+              <w:instrText xml:space="preserve"> PAGEREF _Toc233006786 \h </w:instrText>
             </w:r>
             <w:r>
               <w:rPr>
@@ -1543,7 +1587,7 @@
               <w14:ligatures w14:val="standardContextual"/>
             </w:rPr>
           </w:pPr>
-          <w:hyperlink w:anchor="_Toc232964873" w:history="1">
+          <w:hyperlink w:anchor="_Toc233006787" w:history="1">
             <w:r>
               <w:rPr>
                 <w:rStyle w:val="Hyperlink"/>
@@ -1567,7 +1611,7 @@
               <w:rPr>
                 <w:noProof/>
               </w:rPr>
-              <w:instrText xml:space="preserve"> PAGEREF _Toc232964873 \h </w:instrText>
+              <w:instrText xml:space="preserve"> PAGEREF _Toc233006787 \h </w:instrText>
             </w:r>
             <w:r>
               <w:rPr>
@@ -1609,7 +1653,7 @@
               <w14:ligatures w14:val="standardContextual"/>
             </w:rPr>
           </w:pPr>
-          <w:hyperlink w:anchor="_Toc232964874" w:history="1">
+          <w:hyperlink w:anchor="_Toc233006788" w:history="1">
             <w:r>
               <w:rPr>
                 <w:rStyle w:val="Hyperlink"/>
@@ -1633,7 +1677,7 @@
               <w:rPr>
                 <w:noProof/>
               </w:rPr>
-              <w:instrText xml:space="preserve"> PAGEREF _Toc232964874 \h </w:instrText>
+              <w:instrText xml:space="preserve"> PAGEREF _Toc233006788 \h </w:instrText>
             </w:r>
             <w:r>
               <w:rPr>
@@ -1675,7 +1719,7 @@
               <w14:ligatures w14:val="standardContextual"/>
             </w:rPr>
           </w:pPr>
-          <w:hyperlink w:anchor="_Toc232964875" w:history="1">
+          <w:hyperlink w:anchor="_Toc233006789" w:history="1">
             <w:r>
               <w:rPr>
                 <w:rStyle w:val="Hyperlink"/>
@@ -1699,7 +1743,7 @@
               <w:rPr>
                 <w:noProof/>
               </w:rPr>
-              <w:instrText xml:space="preserve"> PAGEREF _Toc232964875 \h </w:instrText>
+              <w:instrText xml:space="preserve"> PAGEREF _Toc233006789 \h </w:instrText>
             </w:r>
             <w:r>
               <w:rPr>
@@ -1741,7 +1785,7 @@
               <w14:ligatures w14:val="standardContextual"/>
             </w:rPr>
           </w:pPr>
-          <w:hyperlink w:anchor="_Toc232964876" w:history="1">
+          <w:hyperlink w:anchor="_Toc233006790" w:history="1">
             <w:r>
               <w:rPr>
                 <w:rStyle w:val="Hyperlink"/>
@@ -1765,7 +1809,7 @@
               <w:rPr>
                 <w:noProof/>
               </w:rPr>
-              <w:instrText xml:space="preserve"> PAGEREF _Toc232964876 \h </w:instrText>
+              <w:instrText xml:space="preserve"> PAGEREF _Toc233006790 \h </w:instrText>
             </w:r>
             <w:r>
               <w:rPr>
@@ -1807,7 +1851,7 @@
               <w14:ligatures w14:val="standardContextual"/>
             </w:rPr>
           </w:pPr>
-          <w:hyperlink w:anchor="_Toc232964877" w:history="1">
+          <w:hyperlink w:anchor="_Toc233006791" w:history="1">
             <w:r>
               <w:rPr>
                 <w:rStyle w:val="Hyperlink"/>
@@ -1831,7 +1875,7 @@
               <w:rPr>
                 <w:noProof/>
               </w:rPr>
-              <w:instrText xml:space="preserve"> PAGEREF _Toc232964877 \h </w:instrText>
+              <w:instrText xml:space="preserve"> PAGEREF _Toc233006791 \h </w:instrText>
             </w:r>
             <w:r>
               <w:rPr>
@@ -1873,7 +1917,7 @@
               <w14:ligatures w14:val="standardContextual"/>
             </w:rPr>
           </w:pPr>
-          <w:hyperlink w:anchor="_Toc232964878" w:history="1">
+          <w:hyperlink w:anchor="_Toc233006792" w:history="1">
             <w:r>
               <w:rPr>
                 <w:rStyle w:val="Hyperlink"/>
@@ -1897,7 +1941,7 @@
               <w:rPr>
                 <w:noProof/>
               </w:rPr>
-              <w:instrText xml:space="preserve"> PAGEREF _Toc232964878 \h </w:instrText>
+              <w:instrText xml:space="preserve"> PAGEREF _Toc233006792 \h </w:instrText>
             </w:r>
             <w:r>
               <w:rPr>
@@ -1939,7 +1983,7 @@
               <w14:ligatures w14:val="standardContextual"/>
             </w:rPr>
           </w:pPr>
-          <w:hyperlink w:anchor="_Toc232964879" w:history="1">
+          <w:hyperlink w:anchor="_Toc233006793" w:history="1">
             <w:r>
               <w:rPr>
                 <w:rStyle w:val="Hyperlink"/>
@@ -1963,7 +2007,7 @@
               <w:rPr>
                 <w:noProof/>
               </w:rPr>
-              <w:instrText xml:space="preserve"> PAGEREF _Toc232964879 \h </w:instrText>
+              <w:instrText xml:space="preserve"> PAGEREF _Toc233006793 \h </w:instrText>
             </w:r>
             <w:r>
               <w:rPr>
@@ -2005,7 +2049,7 @@
               <w14:ligatures w14:val="standardContextual"/>
             </w:rPr>
           </w:pPr>
-          <w:hyperlink w:anchor="_Toc232964880" w:history="1">
+          <w:hyperlink w:anchor="_Toc233006794" w:history="1">
             <w:r>
               <w:rPr>
                 <w:rStyle w:val="Hyperlink"/>
@@ -2029,7 +2073,7 @@
               <w:rPr>
                 <w:noProof/>
               </w:rPr>
-              <w:instrText xml:space="preserve"> PAGEREF _Toc232964880 \h </w:instrText>
+              <w:instrText xml:space="preserve"> PAGEREF _Toc233006794 \h </w:instrText>
             </w:r>
             <w:r>
               <w:rPr>
@@ -2071,7 +2115,7 @@
               <w14:ligatures w14:val="standardContextual"/>
             </w:rPr>
           </w:pPr>
-          <w:hyperlink w:anchor="_Toc232964881" w:history="1">
+          <w:hyperlink w:anchor="_Toc233006795" w:history="1">
             <w:r>
               <w:rPr>
                 <w:rStyle w:val="Hyperlink"/>
@@ -2095,7 +2139,7 @@
               <w:rPr>
                 <w:noProof/>
               </w:rPr>
-              <w:instrText xml:space="preserve"> PAGEREF _Toc232964881 \h </w:instrText>
+              <w:instrText xml:space="preserve"> PAGEREF _Toc233006795 \h </w:instrText>
             </w:r>
             <w:r>
               <w:rPr>
@@ -2137,7 +2181,7 @@
               <w14:ligatures w14:val="standardContextual"/>
             </w:rPr>
           </w:pPr>
-          <w:hyperlink w:anchor="_Toc232964882" w:history="1">
+          <w:hyperlink w:anchor="_Toc233006796" w:history="1">
             <w:r>
               <w:rPr>
                 <w:rStyle w:val="Hyperlink"/>
@@ -2161,7 +2205,7 @@
               <w:rPr>
                 <w:noProof/>
               </w:rPr>
-              <w:instrText xml:space="preserve"> PAGEREF _Toc232964882 \h </w:instrText>
+              <w:instrText xml:space="preserve"> PAGEREF _Toc233006796 \h </w:instrText>
             </w:r>
             <w:r>
               <w:rPr>
@@ -2203,7 +2247,7 @@
               <w14:ligatures w14:val="standardContextual"/>
             </w:rPr>
           </w:pPr>
-          <w:hyperlink w:anchor="_Toc232964883" w:history="1">
+          <w:hyperlink w:anchor="_Toc233006797" w:history="1">
             <w:r>
               <w:rPr>
                 <w:rStyle w:val="Hyperlink"/>
@@ -2227,7 +2271,7 @@
               <w:rPr>
                 <w:noProof/>
               </w:rPr>
-              <w:instrText xml:space="preserve"> PAGEREF _Toc232964883 \h </w:instrText>
+              <w:instrText xml:space="preserve"> PAGEREF _Toc233006797 \h </w:instrText>
             </w:r>
             <w:r>
               <w:rPr>
@@ -2269,7 +2313,7 @@
               <w14:ligatures w14:val="standardContextual"/>
             </w:rPr>
           </w:pPr>
-          <w:hyperlink w:anchor="_Toc232964884" w:history="1">
+          <w:hyperlink w:anchor="_Toc233006798" w:history="1">
             <w:r>
               <w:rPr>
                 <w:rStyle w:val="Hyperlink"/>
@@ -2293,7 +2337,7 @@
               <w:rPr>
                 <w:noProof/>
               </w:rPr>
-              <w:instrText xml:space="preserve"> PAGEREF _Toc232964884 \h </w:instrText>
+              <w:instrText xml:space="preserve"> PAGEREF _Toc233006798 \h </w:instrText>
             </w:r>
             <w:r>
               <w:rPr>
@@ -2335,7 +2379,7 @@
               <w14:ligatures w14:val="standardContextual"/>
             </w:rPr>
           </w:pPr>
-          <w:hyperlink w:anchor="_Toc232964885" w:history="1">
+          <w:hyperlink w:anchor="_Toc233006799" w:history="1">
             <w:r>
               <w:rPr>
                 <w:rStyle w:val="Hyperlink"/>
@@ -2359,7 +2403,7 @@
               <w:rPr>
                 <w:noProof/>
               </w:rPr>
-              <w:instrText xml:space="preserve"> PAGEREF _Toc232964885 \h </w:instrText>
+              <w:instrText xml:space="preserve"> PAGEREF _Toc233006799 \h </w:instrText>
             </w:r>
             <w:r>
               <w:rPr>
@@ -2401,7 +2445,7 @@
               <w14:ligatures w14:val="standardContextual"/>
             </w:rPr>
           </w:pPr>
-          <w:hyperlink w:anchor="_Toc232964886" w:history="1">
+          <w:hyperlink w:anchor="_Toc233006800" w:history="1">
             <w:r>
               <w:rPr>
                 <w:rStyle w:val="Hyperlink"/>
@@ -2425,7 +2469,7 @@
               <w:rPr>
                 <w:noProof/>
               </w:rPr>
-              <w:instrText xml:space="preserve"> PAGEREF _Toc232964886 \h </w:instrText>
+              <w:instrText xml:space="preserve"> PAGEREF _Toc233006800 \h </w:instrText>
             </w:r>
             <w:r>
               <w:rPr>
@@ -2467,7 +2511,7 @@
               <w14:ligatures w14:val="standardContextual"/>
             </w:rPr>
           </w:pPr>
-          <w:hyperlink w:anchor="_Toc232964887" w:history="1">
+          <w:hyperlink w:anchor="_Toc233006801" w:history="1">
             <w:r>
               <w:rPr>
                 <w:rStyle w:val="Hyperlink"/>
@@ -2491,7 +2535,7 @@
               <w:rPr>
                 <w:noProof/>
               </w:rPr>
-              <w:instrText xml:space="preserve"> PAGEREF _Toc232964887 \h </w:instrText>
+              <w:instrText xml:space="preserve"> PAGEREF _Toc233006801 \h </w:instrText>
             </w:r>
             <w:r>
               <w:rPr>
@@ -2533,7 +2577,7 @@
               <w14:ligatures w14:val="standardContextual"/>
             </w:rPr>
           </w:pPr>
-          <w:hyperlink w:anchor="_Toc232964888" w:history="1">
+          <w:hyperlink w:anchor="_Toc233006802" w:history="1">
             <w:r>
               <w:rPr>
                 <w:rStyle w:val="Hyperlink"/>
@@ -2557,7 +2601,7 @@
               <w:rPr>
                 <w:noProof/>
               </w:rPr>
-              <w:instrText xml:space="preserve"> PAGEREF _Toc232964888 \h </w:instrText>
+              <w:instrText xml:space="preserve"> PAGEREF _Toc233006802 \h </w:instrText>
             </w:r>
             <w:r>
               <w:rPr>
@@ -2599,7 +2643,7 @@
               <w14:ligatures w14:val="standardContextual"/>
             </w:rPr>
           </w:pPr>
-          <w:hyperlink w:anchor="_Toc232964889" w:history="1">
+          <w:hyperlink w:anchor="_Toc233006803" w:history="1">
             <w:r>
               <w:rPr>
                 <w:rStyle w:val="Hyperlink"/>
@@ -2623,7 +2667,7 @@
               <w:rPr>
                 <w:noProof/>
               </w:rPr>
-              <w:instrText xml:space="preserve"> PAGEREF _Toc232964889 \h </w:instrText>
+              <w:instrText xml:space="preserve"> PAGEREF _Toc233006803 \h </w:instrText>
             </w:r>
             <w:r>
               <w:rPr>
@@ -2665,54 +2709,13 @@
               <w14:ligatures w14:val="standardContextual"/>
             </w:rPr>
           </w:pPr>
-          <w:hyperlink w:anchor="_Toc232964890" w:history="1">
+          <w:hyperlink w:anchor="_Toc233006804" w:history="1">
             <w:r>
               <w:rPr>
                 <w:rStyle w:val="Hyperlink"/>
                 <w:noProof/>
-                <w:lang w:val="vi-VN"/>
-              </w:rPr>
-              <w:drawing>
-                <wp:inline distT="0" distB="0" distL="0" distR="0" wp14:anchorId="6BE4D9B3" wp14:editId="4580A695">
-                  <wp:extent cx="5943600" cy="3714750"/>
-                  <wp:effectExtent l="0" t="0" r="0" b="6350"/>
-                  <wp:docPr id="1866144233" name="Picture 9" descr="A screenshot of a computer&#10;&#10;Description automatically generated"/>
-                  <wp:cNvGraphicFramePr>
-                    <a:graphicFrameLocks xmlns:a="http://schemas.openxmlformats.org/drawingml/2006/main" noChangeAspect="1"/>
-                  </wp:cNvGraphicFramePr>
-                  <a:graphic xmlns:a="http://schemas.openxmlformats.org/drawingml/2006/main">
-                    <a:graphicData uri="http://schemas.openxmlformats.org/drawingml/2006/picture">
-                      <pic:pic xmlns:pic="http://schemas.openxmlformats.org/drawingml/2006/picture">
-                        <pic:nvPicPr>
-                          <pic:cNvPr id="1486102370" name="Picture 9" descr="A screenshot of a computer&#10;&#10;Description automatically generated"/>
-                          <pic:cNvPicPr/>
-                        </pic:nvPicPr>
-                        <pic:blipFill>
-                          <a:blip r:embed="rId7" cstate="print">
-                            <a:extLst>
-                              <a:ext uri="{28A0092B-C50C-407E-A947-70E740481C1C}">
-                                <a14:useLocalDpi xmlns:a14="http://schemas.microsoft.com/office/drawing/2010/main" val="0"/>
-                              </a:ext>
-                            </a:extLst>
-                          </a:blip>
-                          <a:stretch>
-                            <a:fillRect/>
-                          </a:stretch>
-                        </pic:blipFill>
-                        <pic:spPr>
-                          <a:xfrm>
-                            <a:off x="0" y="0"/>
-                            <a:ext cx="5943600" cy="3714750"/>
-                          </a:xfrm>
-                          <a:prstGeom prst="rect">
-                            <a:avLst/>
-                          </a:prstGeom>
-                        </pic:spPr>
-                      </pic:pic>
-                    </a:graphicData>
-                  </a:graphic>
-                </wp:inline>
-              </w:drawing>
+              </w:rPr>
+              <w:t>6.5. Timeline tổng quan</w:t>
             </w:r>
             <w:r>
               <w:rPr>
@@ -2730,7 +2733,7 @@
               <w:rPr>
                 <w:noProof/>
               </w:rPr>
-              <w:instrText xml:space="preserve"> PAGEREF _Toc232964890 \h </w:instrText>
+              <w:instrText xml:space="preserve"> PAGEREF _Toc233006804 \h </w:instrText>
             </w:r>
             <w:r>
               <w:rPr>
@@ -2748,6 +2751,72 @@
                 <w:noProof/>
               </w:rPr>
               <w:t>19</w:t>
+            </w:r>
+            <w:r>
+              <w:rPr>
+                <w:noProof/>
+              </w:rPr>
+              <w:fldChar w:fldCharType="end"/>
+            </w:r>
+          </w:hyperlink>
+        </w:p>
+        <w:p>
+          <w:pPr>
+            <w:pStyle w:val="TOC1"/>
+            <w:tabs>
+              <w:tab w:val="right" w:leader="dot" w:pos="9350"/>
+            </w:tabs>
+            <w:rPr>
+              <w:rFonts w:asciiTheme="minorHAnsi" w:eastAsiaTheme="minorEastAsia" w:hAnsiTheme="minorHAnsi" w:cstheme="minorBidi"/>
+              <w:noProof/>
+              <w:kern w:val="2"/>
+              <w:sz w:val="24"/>
+              <w:szCs w:val="24"/>
+              <w14:ligatures w14:val="standardContextual"/>
+            </w:rPr>
+          </w:pPr>
+          <w:hyperlink w:anchor="_Toc233006805" w:history="1">
+            <w:r>
+              <w:rPr>
+                <w:rStyle w:val="Hyperlink"/>
+                <w:noProof/>
+              </w:rPr>
+              <w:t>CHƯƠNG 7: HẠN CHẾ VÀ HƯỚNG PHÁT TRIỂN</w:t>
+            </w:r>
+            <w:r>
+              <w:rPr>
+                <w:noProof/>
+              </w:rPr>
+              <w:tab/>
+            </w:r>
+            <w:r>
+              <w:rPr>
+                <w:noProof/>
+              </w:rPr>
+              <w:fldChar w:fldCharType="begin"/>
+            </w:r>
+            <w:r>
+              <w:rPr>
+                <w:noProof/>
+              </w:rPr>
+              <w:instrText xml:space="preserve"> PAGEREF _Toc233006805 \h </w:instrText>
+            </w:r>
+            <w:r>
+              <w:rPr>
+                <w:noProof/>
+              </w:rPr>
+            </w:r>
+            <w:r>
+              <w:rPr>
+                <w:noProof/>
+              </w:rPr>
+              <w:fldChar w:fldCharType="separate"/>
+            </w:r>
+            <w:r>
+              <w:rPr>
+                <w:noProof/>
+              </w:rPr>
+              <w:t>20</w:t>
             </w:r>
             <w:r>
               <w:rPr>
@@ -2772,13 +2841,13 @@
               <w14:ligatures w14:val="standardContextual"/>
             </w:rPr>
           </w:pPr>
-          <w:hyperlink w:anchor="_Toc232964891" w:history="1">
+          <w:hyperlink w:anchor="_Toc233006806" w:history="1">
             <w:r>
               <w:rPr>
                 <w:rStyle w:val="Hyperlink"/>
                 <w:noProof/>
               </w:rPr>
-              <w:t>6.5. Timeline tổng quan</w:t>
+              <w:t>7.1. Hạn chế hiện tại</w:t>
             </w:r>
             <w:r>
               <w:rPr>
@@ -2796,7 +2865,7 @@
               <w:rPr>
                 <w:noProof/>
               </w:rPr>
-              <w:instrText xml:space="preserve"> PAGEREF _Toc232964891 \h </w:instrText>
+              <w:instrText xml:space="preserve"> PAGEREF _Toc233006806 \h </w:instrText>
             </w:r>
             <w:r>
               <w:rPr>
@@ -2813,7 +2882,73 @@
               <w:rPr>
                 <w:noProof/>
               </w:rPr>
-              <w:t>19</w:t>
+              <w:t>20</w:t>
+            </w:r>
+            <w:r>
+              <w:rPr>
+                <w:noProof/>
+              </w:rPr>
+              <w:fldChar w:fldCharType="end"/>
+            </w:r>
+          </w:hyperlink>
+        </w:p>
+        <w:p>
+          <w:pPr>
+            <w:pStyle w:val="TOC2"/>
+            <w:tabs>
+              <w:tab w:val="right" w:leader="dot" w:pos="9350"/>
+            </w:tabs>
+            <w:rPr>
+              <w:rFonts w:asciiTheme="minorHAnsi" w:eastAsiaTheme="minorEastAsia" w:hAnsiTheme="minorHAnsi" w:cstheme="minorBidi"/>
+              <w:noProof/>
+              <w:kern w:val="2"/>
+              <w:sz w:val="24"/>
+              <w:szCs w:val="24"/>
+              <w14:ligatures w14:val="standardContextual"/>
+            </w:rPr>
+          </w:pPr>
+          <w:hyperlink w:anchor="_Toc233006807" w:history="1">
+            <w:r>
+              <w:rPr>
+                <w:rStyle w:val="Hyperlink"/>
+                <w:noProof/>
+              </w:rPr>
+              <w:t>7.2. Hướng phát triển trong tương lai</w:t>
+            </w:r>
+            <w:r>
+              <w:rPr>
+                <w:noProof/>
+              </w:rPr>
+              <w:tab/>
+            </w:r>
+            <w:r>
+              <w:rPr>
+                <w:noProof/>
+              </w:rPr>
+              <w:fldChar w:fldCharType="begin"/>
+            </w:r>
+            <w:r>
+              <w:rPr>
+                <w:noProof/>
+              </w:rPr>
+              <w:instrText xml:space="preserve"> PAGEREF _Toc233006807 \h </w:instrText>
+            </w:r>
+            <w:r>
+              <w:rPr>
+                <w:noProof/>
+              </w:rPr>
+            </w:r>
+            <w:r>
+              <w:rPr>
+                <w:noProof/>
+              </w:rPr>
+              <w:fldChar w:fldCharType="separate"/>
+            </w:r>
+            <w:r>
+              <w:rPr>
+                <w:noProof/>
+              </w:rPr>
+              <w:t>20</w:t>
             </w:r>
             <w:r>
               <w:rPr>
@@ -2838,13 +2973,13 @@
               <w14:ligatures w14:val="standardContextual"/>
             </w:rPr>
           </w:pPr>
-          <w:hyperlink w:anchor="_Toc232964892" w:history="1">
+          <w:hyperlink w:anchor="_Toc233006808" w:history="1">
             <w:r>
               <w:rPr>
                 <w:rStyle w:val="Hyperlink"/>
                 <w:noProof/>
               </w:rPr>
-              <w:t>CHƯƠNG 7: HẠN CHẾ VÀ HƯỚNG PHÁT TRIỂN</w:t>
+              <w:t>KẾT LUẬN</w:t>
             </w:r>
             <w:r>
               <w:rPr>
@@ -2862,7 +2997,7 @@
               <w:rPr>
                 <w:noProof/>
               </w:rPr>
-              <w:instrText xml:space="preserve"> PAGEREF _Toc232964892 \h </w:instrText>
+              <w:instrText xml:space="preserve"> PAGEREF _Toc233006808 \h </w:instrText>
             </w:r>
             <w:r>
               <w:rPr>
@@ -2879,139 +3014,7 @@
               <w:rPr>
                 <w:noProof/>
               </w:rPr>
-              <w:t>20</w:t>
-            </w:r>
-            <w:r>
-              <w:rPr>
-                <w:noProof/>
-              </w:rPr>
-              <w:fldChar w:fldCharType="end"/>
-            </w:r>
-          </w:hyperlink>
-        </w:p>
-        <w:p>
-          <w:pPr>
-            <w:pStyle w:val="TOC2"/>
-            <w:tabs>
-              <w:tab w:val="right" w:leader="dot" w:pos="9350"/>
-            </w:tabs>
-            <w:rPr>
-              <w:rFonts w:asciiTheme="minorHAnsi" w:eastAsiaTheme="minorEastAsia" w:hAnsiTheme="minorHAnsi" w:cstheme="minorBidi"/>
-              <w:noProof/>
-              <w:kern w:val="2"/>
-              <w:sz w:val="24"/>
-              <w:szCs w:val="24"/>
-              <w14:ligatures w14:val="standardContextual"/>
-            </w:rPr>
-          </w:pPr>
-          <w:hyperlink w:anchor="_Toc232964893" w:history="1">
-            <w:r>
-              <w:rPr>
-                <w:rStyle w:val="Hyperlink"/>
-                <w:noProof/>
-              </w:rPr>
-              <w:t>7.1. Hạn chế hiện tại</w:t>
-            </w:r>
-            <w:r>
-              <w:rPr>
-                <w:noProof/>
-              </w:rPr>
-              <w:tab/>
-            </w:r>
-            <w:r>
-              <w:rPr>
-                <w:noProof/>
-              </w:rPr>
-              <w:fldChar w:fldCharType="begin"/>
-            </w:r>
-            <w:r>
-              <w:rPr>
-                <w:noProof/>
-              </w:rPr>
-              <w:instrText xml:space="preserve"> PAGEREF _Toc232964893 \h </w:instrText>
-            </w:r>
-            <w:r>
-              <w:rPr>
-                <w:noProof/>
-              </w:rPr>
-            </w:r>
-            <w:r>
-              <w:rPr>
-                <w:noProof/>
-              </w:rPr>
-              <w:fldChar w:fldCharType="separate"/>
-            </w:r>
-            <w:r>
-              <w:rPr>
-                <w:noProof/>
-              </w:rPr>
-              <w:t>20</w:t>
-            </w:r>
-            <w:r>
-              <w:rPr>
-                <w:noProof/>
-              </w:rPr>
-              <w:fldChar w:fldCharType="end"/>
-            </w:r>
-          </w:hyperlink>
-        </w:p>
-        <w:p>
-          <w:pPr>
-            <w:pStyle w:val="TOC2"/>
-            <w:tabs>
-              <w:tab w:val="right" w:leader="dot" w:pos="9350"/>
-            </w:tabs>
-            <w:rPr>
-              <w:rFonts w:asciiTheme="minorHAnsi" w:eastAsiaTheme="minorEastAsia" w:hAnsiTheme="minorHAnsi" w:cstheme="minorBidi"/>
-              <w:noProof/>
-              <w:kern w:val="2"/>
-              <w:sz w:val="24"/>
-              <w:szCs w:val="24"/>
-              <w14:ligatures w14:val="standardContextual"/>
-            </w:rPr>
-          </w:pPr>
-          <w:hyperlink w:anchor="_Toc232964894" w:history="1">
-            <w:r>
-              <w:rPr>
-                <w:rStyle w:val="Hyperlink"/>
-                <w:noProof/>
-              </w:rPr>
-              <w:t>7.2. Hướng phát triển trong tương lai</w:t>
-            </w:r>
-            <w:r>
-              <w:rPr>
-                <w:noProof/>
-              </w:rPr>
-              <w:tab/>
-            </w:r>
-            <w:r>
-              <w:rPr>
-                <w:noProof/>
-              </w:rPr>
-              <w:fldChar w:fldCharType="begin"/>
-            </w:r>
-            <w:r>
-              <w:rPr>
-                <w:noProof/>
-              </w:rPr>
-              <w:instrText xml:space="preserve"> PAGEREF _Toc232964894 \h </w:instrText>
-            </w:r>
-            <w:r>
-              <w:rPr>
-                <w:noProof/>
-              </w:rPr>
-            </w:r>
-            <w:r>
-              <w:rPr>
-                <w:noProof/>
-              </w:rPr>
-              <w:fldChar w:fldCharType="separate"/>
-            </w:r>
-            <w:r>
-              <w:rPr>
-                <w:noProof/>
-              </w:rPr>
-              <w:t>20</w:t>
+              <w:t>21</w:t>
             </w:r>
             <w:r>
               <w:rPr>
@@ -3036,13 +3039,13 @@
               <w14:ligatures w14:val="standardContextual"/>
             </w:rPr>
           </w:pPr>
-          <w:hyperlink w:anchor="_Toc232964895" w:history="1">
+          <w:hyperlink w:anchor="_Toc233006809" w:history="1">
             <w:r>
               <w:rPr>
                 <w:rStyle w:val="Hyperlink"/>
                 <w:noProof/>
               </w:rPr>
-              <w:t>KẾT LUẬN</w:t>
+              <w:t>TÀI LIỆU THAM KHẢO</w:t>
             </w:r>
             <w:r>
               <w:rPr>
@@ -3060,73 +3063,7 @@
               <w:rPr>
                 <w:noProof/>
               </w:rPr>
-              <w:instrText xml:space="preserve"> PAGEREF _Toc232964895 \h </w:instrText>
-            </w:r>
-            <w:r>
-              <w:rPr>
-                <w:noProof/>
-              </w:rPr>
-            </w:r>
-            <w:r>
-              <w:rPr>
-                <w:noProof/>
-              </w:rPr>
-              <w:fldChar w:fldCharType="separate"/>
-            </w:r>
-            <w:r>
-              <w:rPr>
-                <w:noProof/>
-              </w:rPr>
-              <w:t>21</w:t>
-            </w:r>
-            <w:r>
-              <w:rPr>
-                <w:noProof/>
-              </w:rPr>
-              <w:fldChar w:fldCharType="end"/>
-            </w:r>
-          </w:hyperlink>
-        </w:p>
-        <w:p>
-          <w:pPr>
-            <w:pStyle w:val="TOC1"/>
-            <w:tabs>
-              <w:tab w:val="right" w:leader="dot" w:pos="9350"/>
-            </w:tabs>
-            <w:rPr>
-              <w:rFonts w:asciiTheme="minorHAnsi" w:eastAsiaTheme="minorEastAsia" w:hAnsiTheme="minorHAnsi" w:cstheme="minorBidi"/>
-              <w:noProof/>
-              <w:kern w:val="2"/>
-              <w:sz w:val="24"/>
-              <w:szCs w:val="24"/>
-              <w14:ligatures w14:val="standardContextual"/>
-            </w:rPr>
-          </w:pPr>
-          <w:hyperlink w:anchor="_Toc232964896" w:history="1">
-            <w:r>
-              <w:rPr>
-                <w:rStyle w:val="Hyperlink"/>
-                <w:noProof/>
-              </w:rPr>
-              <w:t>TÀI LIỆU THAM KHẢO</w:t>
-            </w:r>
-            <w:r>
-              <w:rPr>
-                <w:noProof/>
-              </w:rPr>
-              <w:tab/>
-            </w:r>
-            <w:r>
-              <w:rPr>
-                <w:noProof/>
-              </w:rPr>
-              <w:fldChar w:fldCharType="begin"/>
-            </w:r>
-            <w:r>
-              <w:rPr>
-                <w:noProof/>
-              </w:rPr>
-              <w:instrText xml:space="preserve"> PAGEREF _Toc232964896 \h </w:instrText>
+              <w:instrText xml:space="preserve"> PAGEREF _Toc233006809 \h </w:instrText>
             </w:r>
             <w:r>
               <w:rPr>
@@ -3169,7 +3106,7 @@
       <w:pPr>
         <w:pStyle w:val="Heading1"/>
       </w:pPr>
-      <w:bookmarkStart w:id="1" w:name="_Toc232964854"/>
+      <w:bookmarkStart w:id="1" w:name="_Toc233006768"/>
       <w:r>
         <w:lastRenderedPageBreak/>
         <w:t>CHƯƠNG 1: TỔNG QUAN ĐỀ TÀI</w:t>
@@ -3180,7 +3117,7 @@
       <w:pPr>
         <w:pStyle w:val="Heading2"/>
       </w:pPr>
-      <w:bookmarkStart w:id="2" w:name="_Toc232964855"/>
+      <w:bookmarkStart w:id="2" w:name="_Toc233006769"/>
       <w:r>
         <w:t>1.1. Bối cảnh và lý do chọn đề tài</w:t>
       </w:r>
@@ -3206,7 +3143,7 @@
       <w:pPr>
         <w:pStyle w:val="Heading2"/>
       </w:pPr>
-      <w:bookmarkStart w:id="3" w:name="_Toc232964856"/>
+      <w:bookmarkStart w:id="3" w:name="_Toc233006770"/>
       <w:r>
         <w:t>1.2. Mục tiêu đề tài</w:t>
       </w:r>
@@ -3315,7 +3252,7 @@
       <w:pPr>
         <w:pStyle w:val="Heading2"/>
       </w:pPr>
-      <w:bookmarkStart w:id="4" w:name="_Toc232964857"/>
+      <w:bookmarkStart w:id="4" w:name="_Toc233006771"/>
       <w:r>
         <w:t>1.3. Phạm vi đồ án</w:t>
       </w:r>
@@ -3352,15 +3289,15 @@
         <w:spacing w:after="80" w:line="300" w:lineRule="auto"/>
       </w:pPr>
       <w:r>
+        <w:t>Frontend: giao diện web cho phép người dùng tương tác trực tiếp với các chức năng trên thông qua trình duyệt.</w:t>
+      </w:r>
+    </w:p>
+    <w:p>
+      <w:pPr>
+        <w:spacing w:after="160" w:line="300" w:lineRule="auto"/>
+      </w:pPr>
+      <w:r>
         <w:lastRenderedPageBreak/>
-        <w:t>Frontend: giao diện web cho phép người dùng tương tác trực tiếp với các chức năng trên thông qua trình duyệt.</w:t>
-      </w:r>
-    </w:p>
-    <w:p>
-      <w:pPr>
-        <w:spacing w:after="160" w:line="300" w:lineRule="auto"/>
-      </w:pPr>
-      <w:r>
         <w:t>Đồ án giả định chạy trong môi trường phát triển cục bộ (local development), sử dụng cơ sở dữ liệu nhúng H2 cho mục đích demo, có khả năng chuyển sang MySQL cho môi trường triển khai thực tế. Đồ án không bao gồm các chức năng: xác thực/phân quyền chi tiết theo vai trò ở mức bảo mật production, thông báo real-time, hoặc tích hợp CI/CD.</w:t>
       </w:r>
     </w:p>
@@ -3368,7 +3305,7 @@
       <w:pPr>
         <w:pStyle w:val="Heading2"/>
       </w:pPr>
-      <w:bookmarkStart w:id="5" w:name="_Toc232964858"/>
+      <w:bookmarkStart w:id="5" w:name="_Toc233006772"/>
       <w:r>
         <w:t>1.4. Công nghệ sử dụng</w:t>
       </w:r>
@@ -3396,12 +3333,6 @@
         <w:gridCol w:w="6560"/>
       </w:tblGrid>
       <w:tr>
-        <w:tblPrEx>
-          <w:tblCellMar>
-            <w:top w:w="0" w:type="dxa"/>
-            <w:bottom w:w="0" w:type="dxa"/>
-          </w:tblCellMar>
-        </w:tblPrEx>
         <w:tc>
           <w:tcPr>
             <w:tcW w:w="2800" w:type="dxa"/>
@@ -3464,12 +3395,6 @@
         </w:tc>
       </w:tr>
       <w:tr>
-        <w:tblPrEx>
-          <w:tblCellMar>
-            <w:top w:w="0" w:type="dxa"/>
-            <w:bottom w:w="0" w:type="dxa"/>
-          </w:tblCellMar>
-        </w:tblPrEx>
         <w:tc>
           <w:tcPr>
             <w:tcW w:w="2800" w:type="dxa"/>
@@ -3526,12 +3451,6 @@
         </w:tc>
       </w:tr>
       <w:tr>
-        <w:tblPrEx>
-          <w:tblCellMar>
-            <w:top w:w="0" w:type="dxa"/>
-            <w:bottom w:w="0" w:type="dxa"/>
-          </w:tblCellMar>
-        </w:tblPrEx>
         <w:tc>
           <w:tcPr>
             <w:tcW w:w="2800" w:type="dxa"/>
@@ -3588,12 +3507,6 @@
         </w:tc>
       </w:tr>
       <w:tr>
-        <w:tblPrEx>
-          <w:tblCellMar>
-            <w:top w:w="0" w:type="dxa"/>
-            <w:bottom w:w="0" w:type="dxa"/>
-          </w:tblCellMar>
-        </w:tblPrEx>
         <w:tc>
           <w:tcPr>
             <w:tcW w:w="2800" w:type="dxa"/>
@@ -3650,12 +3563,6 @@
         </w:tc>
       </w:tr>
       <w:tr>
-        <w:tblPrEx>
-          <w:tblCellMar>
-            <w:top w:w="0" w:type="dxa"/>
-            <w:bottom w:w="0" w:type="dxa"/>
-          </w:tblCellMar>
-        </w:tblPrEx>
         <w:tc>
           <w:tcPr>
             <w:tcW w:w="2800" w:type="dxa"/>
@@ -3712,12 +3619,6 @@
         </w:tc>
       </w:tr>
       <w:tr>
-        <w:tblPrEx>
-          <w:tblCellMar>
-            <w:top w:w="0" w:type="dxa"/>
-            <w:bottom w:w="0" w:type="dxa"/>
-          </w:tblCellMar>
-        </w:tblPrEx>
         <w:tc>
           <w:tcPr>
             <w:tcW w:w="2800" w:type="dxa"/>
@@ -3774,12 +3675,6 @@
         </w:tc>
       </w:tr>
       <w:tr>
-        <w:tblPrEx>
-          <w:tblCellMar>
-            <w:top w:w="0" w:type="dxa"/>
-            <w:bottom w:w="0" w:type="dxa"/>
-          </w:tblCellMar>
-        </w:tblPrEx>
         <w:tc>
           <w:tcPr>
             <w:tcW w:w="2800" w:type="dxa"/>
@@ -3836,12 +3731,6 @@
         </w:tc>
       </w:tr>
       <w:tr>
-        <w:tblPrEx>
-          <w:tblCellMar>
-            <w:top w:w="0" w:type="dxa"/>
-            <w:bottom w:w="0" w:type="dxa"/>
-          </w:tblCellMar>
-        </w:tblPrEx>
         <w:tc>
           <w:tcPr>
             <w:tcW w:w="2800" w:type="dxa"/>
@@ -3898,12 +3787,6 @@
         </w:tc>
       </w:tr>
       <w:tr>
-        <w:tblPrEx>
-          <w:tblCellMar>
-            <w:top w:w="0" w:type="dxa"/>
-            <w:bottom w:w="0" w:type="dxa"/>
-          </w:tblCellMar>
-        </w:tblPrEx>
         <w:tc>
           <w:tcPr>
             <w:tcW w:w="2800" w:type="dxa"/>
@@ -3960,12 +3843,6 @@
         </w:tc>
       </w:tr>
       <w:tr>
-        <w:tblPrEx>
-          <w:tblCellMar>
-            <w:top w:w="0" w:type="dxa"/>
-            <w:bottom w:w="0" w:type="dxa"/>
-          </w:tblCellMar>
-        </w:tblPrEx>
         <w:tc>
           <w:tcPr>
             <w:tcW w:w="2800" w:type="dxa"/>
@@ -4022,12 +3899,6 @@
         </w:tc>
       </w:tr>
       <w:tr>
-        <w:tblPrEx>
-          <w:tblCellMar>
-            <w:top w:w="0" w:type="dxa"/>
-            <w:bottom w:w="0" w:type="dxa"/>
-          </w:tblCellMar>
-        </w:tblPrEx>
         <w:tc>
           <w:tcPr>
             <w:tcW w:w="2800" w:type="dxa"/>
@@ -4084,12 +3955,6 @@
         </w:tc>
       </w:tr>
       <w:tr>
-        <w:tblPrEx>
-          <w:tblCellMar>
-            <w:top w:w="0" w:type="dxa"/>
-            <w:bottom w:w="0" w:type="dxa"/>
-          </w:tblCellMar>
-        </w:tblPrEx>
         <w:tc>
           <w:tcPr>
             <w:tcW w:w="2800" w:type="dxa"/>
@@ -4146,12 +4011,6 @@
         </w:tc>
       </w:tr>
       <w:tr>
-        <w:tblPrEx>
-          <w:tblCellMar>
-            <w:top w:w="0" w:type="dxa"/>
-            <w:bottom w:w="0" w:type="dxa"/>
-          </w:tblCellMar>
-        </w:tblPrEx>
         <w:tc>
           <w:tcPr>
             <w:tcW w:w="2800" w:type="dxa"/>
@@ -4217,7 +4076,7 @@
       <w:pPr>
         <w:pStyle w:val="Heading1"/>
       </w:pPr>
-      <w:bookmarkStart w:id="6" w:name="_Toc232964859"/>
+      <w:bookmarkStart w:id="6" w:name="_Toc233006773"/>
       <w:r>
         <w:lastRenderedPageBreak/>
         <w:t>CHƯƠNG 2: PHÂN TÍCH YÊU CẦU</w:t>
@@ -4228,7 +4087,7 @@
       <w:pPr>
         <w:pStyle w:val="Heading2"/>
       </w:pPr>
-      <w:bookmarkStart w:id="7" w:name="_Toc232964860"/>
+      <w:bookmarkStart w:id="7" w:name="_Toc233006774"/>
       <w:r>
         <w:t>2.1. Tác nhân hệ thống (Actors)</w:t>
       </w:r>
@@ -4264,12 +4123,6 @@
         <w:gridCol w:w="7160"/>
       </w:tblGrid>
       <w:tr>
-        <w:tblPrEx>
-          <w:tblCellMar>
-            <w:top w:w="0" w:type="dxa"/>
-            <w:bottom w:w="0" w:type="dxa"/>
-          </w:tblCellMar>
-        </w:tblPrEx>
         <w:tc>
           <w:tcPr>
             <w:tcW w:w="2200" w:type="dxa"/>
@@ -4332,12 +4185,6 @@
         </w:tc>
       </w:tr>
       <w:tr>
-        <w:tblPrEx>
-          <w:tblCellMar>
-            <w:top w:w="0" w:type="dxa"/>
-            <w:bottom w:w="0" w:type="dxa"/>
-          </w:tblCellMar>
-        </w:tblPrEx>
         <w:tc>
           <w:tcPr>
             <w:tcW w:w="2200" w:type="dxa"/>
@@ -4394,12 +4241,6 @@
         </w:tc>
       </w:tr>
       <w:tr>
-        <w:tblPrEx>
-          <w:tblCellMar>
-            <w:top w:w="0" w:type="dxa"/>
-            <w:bottom w:w="0" w:type="dxa"/>
-          </w:tblCellMar>
-        </w:tblPrEx>
         <w:tc>
           <w:tcPr>
             <w:tcW w:w="2200" w:type="dxa"/>
@@ -4456,12 +4297,6 @@
         </w:tc>
       </w:tr>
       <w:tr>
-        <w:tblPrEx>
-          <w:tblCellMar>
-            <w:top w:w="0" w:type="dxa"/>
-            <w:bottom w:w="0" w:type="dxa"/>
-          </w:tblCellMar>
-        </w:tblPrEx>
         <w:tc>
           <w:tcPr>
             <w:tcW w:w="2200" w:type="dxa"/>
@@ -4522,7 +4357,7 @@
       <w:pPr>
         <w:pStyle w:val="Heading2"/>
       </w:pPr>
-      <w:bookmarkStart w:id="8" w:name="_Toc232964861"/>
+      <w:bookmarkStart w:id="8" w:name="_Toc233006775"/>
       <w:r>
         <w:t>2.2. Yêu cầu chức năng</w:t>
       </w:r>
@@ -4532,7 +4367,7 @@
       <w:pPr>
         <w:pStyle w:val="Heading3"/>
       </w:pPr>
-      <w:bookmarkStart w:id="9" w:name="_Toc232964862"/>
+      <w:bookmarkStart w:id="9" w:name="_Toc233006776"/>
       <w:r>
         <w:t>2.2.1. Quản lý dự án (Project)</w:t>
       </w:r>
@@ -4594,7 +4429,7 @@
       <w:pPr>
         <w:pStyle w:val="Heading3"/>
       </w:pPr>
-      <w:bookmarkStart w:id="10" w:name="_Toc232964863"/>
+      <w:bookmarkStart w:id="10" w:name="_Toc233006777"/>
       <w:r>
         <w:t>2.2.2. Quản lý Epic và Backlog</w:t>
       </w:r>
@@ -4643,7 +4478,7 @@
       <w:pPr>
         <w:pStyle w:val="Heading3"/>
       </w:pPr>
-      <w:bookmarkStart w:id="11" w:name="_Toc232964864"/>
+      <w:bookmarkStart w:id="11" w:name="_Toc233006778"/>
       <w:r>
         <w:t>2.2.3. Lập kế hoạch và thực thi Sprint</w:t>
       </w:r>
@@ -4698,16 +4533,16 @@
         <w:spacing w:after="80" w:line="300" w:lineRule="auto"/>
       </w:pPr>
       <w:r>
+        <w:t>Hoàn tất Sprint (complete sprint): các Work Item chưa hoàn thành được chuyển sang một Sprint khác hoặc đưa về Backlog.</w:t>
+      </w:r>
+    </w:p>
+    <w:p>
+      <w:pPr>
+        <w:pStyle w:val="Heading3"/>
+      </w:pPr>
+      <w:bookmarkStart w:id="12" w:name="_Toc233006779"/>
+      <w:r>
         <w:lastRenderedPageBreak/>
-        <w:t>Hoàn tất Sprint (complete sprint): các Work Item chưa hoàn thành được chuyển sang một Sprint khác hoặc đưa về Backlog.</w:t>
-      </w:r>
-    </w:p>
-    <w:p>
-      <w:pPr>
-        <w:pStyle w:val="Heading3"/>
-      </w:pPr>
-      <w:bookmarkStart w:id="12" w:name="_Toc232964865"/>
-      <w:r>
         <w:t>2.2.4. Quản lý nguồn nhân lực (Resource)</w:t>
       </w:r>
       <w:bookmarkEnd w:id="12"/>
@@ -4755,7 +4590,7 @@
       <w:pPr>
         <w:pStyle w:val="Heading3"/>
       </w:pPr>
-      <w:bookmarkStart w:id="13" w:name="_Toc232964866"/>
+      <w:bookmarkStart w:id="13" w:name="_Toc233006780"/>
       <w:r>
         <w:t>2.2.5. Quản lý chi phí (Cost)</w:t>
       </w:r>
@@ -4804,7 +4639,7 @@
       <w:pPr>
         <w:pStyle w:val="Heading3"/>
       </w:pPr>
-      <w:bookmarkStart w:id="14" w:name="_Toc232964867"/>
+      <w:bookmarkStart w:id="14" w:name="_Toc233006781"/>
       <w:r>
         <w:t>2.2.6. Timeline tổng quan</w:t>
       </w:r>
@@ -4827,7 +4662,7 @@
       <w:pPr>
         <w:pStyle w:val="Heading2"/>
       </w:pPr>
-      <w:bookmarkStart w:id="15" w:name="_Toc232964868"/>
+      <w:bookmarkStart w:id="15" w:name="_Toc233006782"/>
       <w:r>
         <w:t>2.3. Yêu cầu phi chức năng</w:t>
       </w:r>
@@ -4907,7 +4742,7 @@
       <w:pPr>
         <w:pStyle w:val="Heading1"/>
       </w:pPr>
-      <w:bookmarkStart w:id="16" w:name="_Toc232964869"/>
+      <w:bookmarkStart w:id="16" w:name="_Toc233006783"/>
       <w:r>
         <w:lastRenderedPageBreak/>
         <w:t>CHƯƠNG 3: THIẾT KẾ HỆ THỐNG</w:t>
@@ -4918,7 +4753,7 @@
       <w:pPr>
         <w:pStyle w:val="Heading2"/>
       </w:pPr>
-      <w:bookmarkStart w:id="17" w:name="_Toc232964870"/>
+      <w:bookmarkStart w:id="17" w:name="_Toc233006784"/>
       <w:r>
         <w:t>3.1. Kiến trúc tổng thể</w:t>
       </w:r>
@@ -5016,12 +4851,6 @@
         <w:gridCol w:w="6960"/>
       </w:tblGrid>
       <w:tr>
-        <w:tblPrEx>
-          <w:tblCellMar>
-            <w:top w:w="0" w:type="dxa"/>
-            <w:bottom w:w="0" w:type="dxa"/>
-          </w:tblCellMar>
-        </w:tblPrEx>
         <w:tc>
           <w:tcPr>
             <w:tcW w:w="2400" w:type="dxa"/>
@@ -5084,12 +4913,6 @@
         </w:tc>
       </w:tr>
       <w:tr>
-        <w:tblPrEx>
-          <w:tblCellMar>
-            <w:top w:w="0" w:type="dxa"/>
-            <w:bottom w:w="0" w:type="dxa"/>
-          </w:tblCellMar>
-        </w:tblPrEx>
         <w:tc>
           <w:tcPr>
             <w:tcW w:w="2400" w:type="dxa"/>
@@ -5146,12 +4969,6 @@
         </w:tc>
       </w:tr>
       <w:tr>
-        <w:tblPrEx>
-          <w:tblCellMar>
-            <w:top w:w="0" w:type="dxa"/>
-            <w:bottom w:w="0" w:type="dxa"/>
-          </w:tblCellMar>
-        </w:tblPrEx>
         <w:tc>
           <w:tcPr>
             <w:tcW w:w="2400" w:type="dxa"/>
@@ -5208,12 +5025,6 @@
         </w:tc>
       </w:tr>
       <w:tr>
-        <w:tblPrEx>
-          <w:tblCellMar>
-            <w:top w:w="0" w:type="dxa"/>
-            <w:bottom w:w="0" w:type="dxa"/>
-          </w:tblCellMar>
-        </w:tblPrEx>
         <w:tc>
           <w:tcPr>
             <w:tcW w:w="2400" w:type="dxa"/>
@@ -5270,12 +5081,6 @@
         </w:tc>
       </w:tr>
       <w:tr>
-        <w:tblPrEx>
-          <w:tblCellMar>
-            <w:top w:w="0" w:type="dxa"/>
-            <w:bottom w:w="0" w:type="dxa"/>
-          </w:tblCellMar>
-        </w:tblPrEx>
         <w:tc>
           <w:tcPr>
             <w:tcW w:w="2400" w:type="dxa"/>
@@ -5332,12 +5137,6 @@
         </w:tc>
       </w:tr>
       <w:tr>
-        <w:tblPrEx>
-          <w:tblCellMar>
-            <w:top w:w="0" w:type="dxa"/>
-            <w:bottom w:w="0" w:type="dxa"/>
-          </w:tblCellMar>
-        </w:tblPrEx>
         <w:tc>
           <w:tcPr>
             <w:tcW w:w="2400" w:type="dxa"/>
@@ -5394,12 +5193,6 @@
         </w:tc>
       </w:tr>
       <w:tr>
-        <w:tblPrEx>
-          <w:tblCellMar>
-            <w:top w:w="0" w:type="dxa"/>
-            <w:bottom w:w="0" w:type="dxa"/>
-          </w:tblCellMar>
-        </w:tblPrEx>
         <w:tc>
           <w:tcPr>
             <w:tcW w:w="2400" w:type="dxa"/>
@@ -5456,12 +5249,6 @@
         </w:tc>
       </w:tr>
       <w:tr>
-        <w:tblPrEx>
-          <w:tblCellMar>
-            <w:top w:w="0" w:type="dxa"/>
-            <w:bottom w:w="0" w:type="dxa"/>
-          </w:tblCellMar>
-        </w:tblPrEx>
         <w:tc>
           <w:tcPr>
             <w:tcW w:w="2400" w:type="dxa"/>
@@ -5518,12 +5305,6 @@
         </w:tc>
       </w:tr>
       <w:tr>
-        <w:tblPrEx>
-          <w:tblCellMar>
-            <w:top w:w="0" w:type="dxa"/>
-            <w:bottom w:w="0" w:type="dxa"/>
-          </w:tblCellMar>
-        </w:tblPrEx>
         <w:tc>
           <w:tcPr>
             <w:tcW w:w="2400" w:type="dxa"/>
@@ -5584,7 +5365,7 @@
       <w:pPr>
         <w:pStyle w:val="Heading2"/>
       </w:pPr>
-      <w:bookmarkStart w:id="18" w:name="_Toc232964871"/>
+      <w:bookmarkStart w:id="18" w:name="_Toc233006785"/>
       <w:r>
         <w:t>3.2. Thiết kế cơ sở dữ liệu (Entity – Relationship)</w:t>
       </w:r>
@@ -5595,8 +5376,11 @@
         <w:spacing w:after="160" w:line="300" w:lineRule="auto"/>
       </w:pPr>
       <w:r>
+        <w:t xml:space="preserve">Mô hình dữ liệu xoay quanh thực thể trung tâm Project, được phân rã theo cấu trúc Scrum: Project chứa nhiều Epic, Epic chứa nhiều Work Item, Work Item có thể được gán vào một </w:t>
+      </w:r>
+      <w:r>
         <w:lastRenderedPageBreak/>
-        <w:t>Mô hình dữ liệu xoay quanh thực thể trung tâm Project, được phân rã theo cấu trúc Scrum: Project chứa nhiều Epic, Epic chứa nhiều Work Item, Work Item có thể được gán vào một Sprint. Nguồn lực (Person) và chi phí (Cost) được quản lý dùng chung và gán linh hoạt vào Epic hoặc Work Item thông qua các bảng quan hệ trung gian.</w:t>
+        <w:t>Sprint. Nguồn lực (Person) và chi phí (Cost) được quản lý dùng chung và gán linh hoạt vào Epic hoặc Work Item thông qua các bảng quan hệ trung gian.</w:t>
       </w:r>
     </w:p>
     <w:tbl>
@@ -5621,12 +5405,6 @@
         <w:gridCol w:w="7360"/>
       </w:tblGrid>
       <w:tr>
-        <w:tblPrEx>
-          <w:tblCellMar>
-            <w:top w:w="0" w:type="dxa"/>
-            <w:bottom w:w="0" w:type="dxa"/>
-          </w:tblCellMar>
-        </w:tblPrEx>
         <w:tc>
           <w:tcPr>
             <w:tcW w:w="2000" w:type="dxa"/>
@@ -5689,12 +5467,6 @@
         </w:tc>
       </w:tr>
       <w:tr>
-        <w:tblPrEx>
-          <w:tblCellMar>
-            <w:top w:w="0" w:type="dxa"/>
-            <w:bottom w:w="0" w:type="dxa"/>
-          </w:tblCellMar>
-        </w:tblPrEx>
         <w:tc>
           <w:tcPr>
             <w:tcW w:w="2000" w:type="dxa"/>
@@ -5751,12 +5523,6 @@
         </w:tc>
       </w:tr>
       <w:tr>
-        <w:tblPrEx>
-          <w:tblCellMar>
-            <w:top w:w="0" w:type="dxa"/>
-            <w:bottom w:w="0" w:type="dxa"/>
-          </w:tblCellMar>
-        </w:tblPrEx>
         <w:tc>
           <w:tcPr>
             <w:tcW w:w="2000" w:type="dxa"/>
@@ -5813,12 +5579,6 @@
         </w:tc>
       </w:tr>
       <w:tr>
-        <w:tblPrEx>
-          <w:tblCellMar>
-            <w:top w:w="0" w:type="dxa"/>
-            <w:bottom w:w="0" w:type="dxa"/>
-          </w:tblCellMar>
-        </w:tblPrEx>
         <w:tc>
           <w:tcPr>
             <w:tcW w:w="2000" w:type="dxa"/>
@@ -5875,12 +5635,6 @@
         </w:tc>
       </w:tr>
       <w:tr>
-        <w:tblPrEx>
-          <w:tblCellMar>
-            <w:top w:w="0" w:type="dxa"/>
-            <w:bottom w:w="0" w:type="dxa"/>
-          </w:tblCellMar>
-        </w:tblPrEx>
         <w:tc>
           <w:tcPr>
             <w:tcW w:w="2000" w:type="dxa"/>
@@ -5937,12 +5691,6 @@
         </w:tc>
       </w:tr>
       <w:tr>
-        <w:tblPrEx>
-          <w:tblCellMar>
-            <w:top w:w="0" w:type="dxa"/>
-            <w:bottom w:w="0" w:type="dxa"/>
-          </w:tblCellMar>
-        </w:tblPrEx>
         <w:tc>
           <w:tcPr>
             <w:tcW w:w="2000" w:type="dxa"/>
@@ -5999,12 +5747,6 @@
         </w:tc>
       </w:tr>
       <w:tr>
-        <w:tblPrEx>
-          <w:tblCellMar>
-            <w:top w:w="0" w:type="dxa"/>
-            <w:bottom w:w="0" w:type="dxa"/>
-          </w:tblCellMar>
-        </w:tblPrEx>
         <w:tc>
           <w:tcPr>
             <w:tcW w:w="2000" w:type="dxa"/>
@@ -6061,12 +5803,6 @@
         </w:tc>
       </w:tr>
       <w:tr>
-        <w:tblPrEx>
-          <w:tblCellMar>
-            <w:top w:w="0" w:type="dxa"/>
-            <w:bottom w:w="0" w:type="dxa"/>
-          </w:tblCellMar>
-        </w:tblPrEx>
         <w:tc>
           <w:tcPr>
             <w:tcW w:w="2000" w:type="dxa"/>
@@ -6123,12 +5859,6 @@
         </w:tc>
       </w:tr>
       <w:tr>
-        <w:tblPrEx>
-          <w:tblCellMar>
-            <w:top w:w="0" w:type="dxa"/>
-            <w:bottom w:w="0" w:type="dxa"/>
-          </w:tblCellMar>
-        </w:tblPrEx>
         <w:tc>
           <w:tcPr>
             <w:tcW w:w="2000" w:type="dxa"/>
@@ -6251,15 +5981,18 @@
         <w:spacing w:after="160" w:line="300" w:lineRule="auto"/>
       </w:pPr>
       <w:r>
+        <w:t xml:space="preserve">Một điểm thiết kế đáng chú ý: PersonAssignment và CostAssignment đều áp dụng ràng buộc "loại trừ lẫn nhau" (mutual exclusivity) — một assignment chỉ được gắn với Epic hoặc Work Item, không được gắn đồng thời cả hai, và ràng buộc này được kiểm tra ở hai lớp: tại tầng entity (thông qua callback @PrePersist/@PreUpdate của JPA) và tại tầng service (trước khi gọi </w:t>
+      </w:r>
+      <w:r>
         <w:lastRenderedPageBreak/>
-        <w:t>Một điểm thiết kế đáng chú ý: PersonAssignment và CostAssignment đều áp dụng ràng buộc "loại trừ lẫn nhau" (mutual exclusivity) — một assignment chỉ được gắn với Epic hoặc Work Item, không được gắn đồng thời cả hai, và ràng buộc này được kiểm tra ở hai lớp: tại tầng entity (thông qua callback @PrePersist/@PreUpdate của JPA) và tại tầng service (trước khi gọi repository lưu dữ liệu), đảm bảo tính nhất quán dữ liệu ngay cả khi có thao tác ghi trực tiếp ngoài luồng service thông thường.</w:t>
+        <w:t>repository lưu dữ liệu), đảm bảo tính nhất quán dữ liệu ngay cả khi có thao tác ghi trực tiếp ngoài luồng service thông thường.</w:t>
       </w:r>
     </w:p>
     <w:p>
       <w:pPr>
         <w:pStyle w:val="Heading2"/>
       </w:pPr>
-      <w:bookmarkStart w:id="19" w:name="_Toc232964872"/>
+      <w:bookmarkStart w:id="19" w:name="_Toc233006786"/>
       <w:r>
         <w:t>3.3. Thiết kế API (REST endpoints)</w:t>
       </w:r>
@@ -6296,12 +6029,6 @@
         <w:gridCol w:w="3960"/>
       </w:tblGrid>
       <w:tr>
-        <w:tblPrEx>
-          <w:tblCellMar>
-            <w:top w:w="0" w:type="dxa"/>
-            <w:bottom w:w="0" w:type="dxa"/>
-          </w:tblCellMar>
-        </w:tblPrEx>
         <w:tc>
           <w:tcPr>
             <w:tcW w:w="2400" w:type="dxa"/>
@@ -6394,12 +6121,6 @@
         </w:tc>
       </w:tr>
       <w:tr>
-        <w:tblPrEx>
-          <w:tblCellMar>
-            <w:top w:w="0" w:type="dxa"/>
-            <w:bottom w:w="0" w:type="dxa"/>
-          </w:tblCellMar>
-        </w:tblPrEx>
         <w:tc>
           <w:tcPr>
             <w:tcW w:w="2400" w:type="dxa"/>
@@ -6483,12 +6204,6 @@
         </w:tc>
       </w:tr>
       <w:tr>
-        <w:tblPrEx>
-          <w:tblCellMar>
-            <w:top w:w="0" w:type="dxa"/>
-            <w:bottom w:w="0" w:type="dxa"/>
-          </w:tblCellMar>
-        </w:tblPrEx>
         <w:tc>
           <w:tcPr>
             <w:tcW w:w="2400" w:type="dxa"/>
@@ -6572,12 +6287,6 @@
         </w:tc>
       </w:tr>
       <w:tr>
-        <w:tblPrEx>
-          <w:tblCellMar>
-            <w:top w:w="0" w:type="dxa"/>
-            <w:bottom w:w="0" w:type="dxa"/>
-          </w:tblCellMar>
-        </w:tblPrEx>
         <w:tc>
           <w:tcPr>
             <w:tcW w:w="2400" w:type="dxa"/>
@@ -6661,12 +6370,6 @@
         </w:tc>
       </w:tr>
       <w:tr>
-        <w:tblPrEx>
-          <w:tblCellMar>
-            <w:top w:w="0" w:type="dxa"/>
-            <w:bottom w:w="0" w:type="dxa"/>
-          </w:tblCellMar>
-        </w:tblPrEx>
         <w:tc>
           <w:tcPr>
             <w:tcW w:w="2400" w:type="dxa"/>
@@ -6750,12 +6453,6 @@
         </w:tc>
       </w:tr>
       <w:tr>
-        <w:tblPrEx>
-          <w:tblCellMar>
-            <w:top w:w="0" w:type="dxa"/>
-            <w:bottom w:w="0" w:type="dxa"/>
-          </w:tblCellMar>
-        </w:tblPrEx>
         <w:tc>
           <w:tcPr>
             <w:tcW w:w="2400" w:type="dxa"/>
@@ -6839,12 +6536,6 @@
         </w:tc>
       </w:tr>
       <w:tr>
-        <w:tblPrEx>
-          <w:tblCellMar>
-            <w:top w:w="0" w:type="dxa"/>
-            <w:bottom w:w="0" w:type="dxa"/>
-          </w:tblCellMar>
-        </w:tblPrEx>
         <w:tc>
           <w:tcPr>
             <w:tcW w:w="2400" w:type="dxa"/>
@@ -6928,12 +6619,6 @@
         </w:tc>
       </w:tr>
       <w:tr>
-        <w:tblPrEx>
-          <w:tblCellMar>
-            <w:top w:w="0" w:type="dxa"/>
-            <w:bottom w:w="0" w:type="dxa"/>
-          </w:tblCellMar>
-        </w:tblPrEx>
         <w:tc>
           <w:tcPr>
             <w:tcW w:w="2400" w:type="dxa"/>
@@ -7092,8 +6777,32 @@
     <w:p>
       <w:pPr>
         <w:pStyle w:val="Heading2"/>
-      </w:pPr>
-      <w:bookmarkStart w:id="20" w:name="_Toc232964873"/>
+        <w:rPr>
+          <w:lang w:val="vi-VN"/>
+        </w:rPr>
+      </w:pPr>
+    </w:p>
+    <w:p>
+      <w:pPr>
+        <w:pStyle w:val="Heading2"/>
+        <w:rPr>
+          <w:lang w:val="vi-VN"/>
+        </w:rPr>
+      </w:pPr>
+    </w:p>
+    <w:p>
+      <w:pPr>
+        <w:pStyle w:val="Heading2"/>
+        <w:rPr>
+          <w:lang w:val="vi-VN"/>
+        </w:rPr>
+      </w:pPr>
+    </w:p>
+    <w:p>
+      <w:pPr>
+        <w:pStyle w:val="Heading2"/>
+      </w:pPr>
+      <w:bookmarkStart w:id="20" w:name="_Toc233006787"/>
       <w:r>
         <w:lastRenderedPageBreak/>
         <w:t>3.4. Thiết kế giao diện (Frontend)</w:t>
@@ -7130,12 +6839,6 @@
         <w:gridCol w:w="6960"/>
       </w:tblGrid>
       <w:tr>
-        <w:tblPrEx>
-          <w:tblCellMar>
-            <w:top w:w="0" w:type="dxa"/>
-            <w:bottom w:w="0" w:type="dxa"/>
-          </w:tblCellMar>
-        </w:tblPrEx>
         <w:tc>
           <w:tcPr>
             <w:tcW w:w="2400" w:type="dxa"/>
@@ -7198,12 +6901,6 @@
         </w:tc>
       </w:tr>
       <w:tr>
-        <w:tblPrEx>
-          <w:tblCellMar>
-            <w:top w:w="0" w:type="dxa"/>
-            <w:bottom w:w="0" w:type="dxa"/>
-          </w:tblCellMar>
-        </w:tblPrEx>
         <w:tc>
           <w:tcPr>
             <w:tcW w:w="2400" w:type="dxa"/>
@@ -7260,12 +6957,6 @@
         </w:tc>
       </w:tr>
       <w:tr>
-        <w:tblPrEx>
-          <w:tblCellMar>
-            <w:top w:w="0" w:type="dxa"/>
-            <w:bottom w:w="0" w:type="dxa"/>
-          </w:tblCellMar>
-        </w:tblPrEx>
         <w:tc>
           <w:tcPr>
             <w:tcW w:w="2400" w:type="dxa"/>
@@ -7322,12 +7013,6 @@
         </w:tc>
       </w:tr>
       <w:tr>
-        <w:tblPrEx>
-          <w:tblCellMar>
-            <w:top w:w="0" w:type="dxa"/>
-            <w:bottom w:w="0" w:type="dxa"/>
-          </w:tblCellMar>
-        </w:tblPrEx>
         <w:tc>
           <w:tcPr>
             <w:tcW w:w="2400" w:type="dxa"/>
@@ -7384,12 +7069,6 @@
         </w:tc>
       </w:tr>
       <w:tr>
-        <w:tblPrEx>
-          <w:tblCellMar>
-            <w:top w:w="0" w:type="dxa"/>
-            <w:bottom w:w="0" w:type="dxa"/>
-          </w:tblCellMar>
-        </w:tblPrEx>
         <w:tc>
           <w:tcPr>
             <w:tcW w:w="2400" w:type="dxa"/>
@@ -7446,12 +7125,6 @@
         </w:tc>
       </w:tr>
       <w:tr>
-        <w:tblPrEx>
-          <w:tblCellMar>
-            <w:top w:w="0" w:type="dxa"/>
-            <w:bottom w:w="0" w:type="dxa"/>
-          </w:tblCellMar>
-        </w:tblPrEx>
         <w:tc>
           <w:tcPr>
             <w:tcW w:w="2400" w:type="dxa"/>
@@ -7508,12 +7181,6 @@
         </w:tc>
       </w:tr>
       <w:tr>
-        <w:tblPrEx>
-          <w:tblCellMar>
-            <w:top w:w="0" w:type="dxa"/>
-            <w:bottom w:w="0" w:type="dxa"/>
-          </w:tblCellMar>
-        </w:tblPrEx>
         <w:tc>
           <w:tcPr>
             <w:tcW w:w="2400" w:type="dxa"/>
@@ -7570,12 +7237,6 @@
         </w:tc>
       </w:tr>
       <w:tr>
-        <w:tblPrEx>
-          <w:tblCellMar>
-            <w:top w:w="0" w:type="dxa"/>
-            <w:bottom w:w="0" w:type="dxa"/>
-          </w:tblCellMar>
-        </w:tblPrEx>
         <w:tc>
           <w:tcPr>
             <w:tcW w:w="2400" w:type="dxa"/>
@@ -7657,7 +7318,7 @@
       <w:pPr>
         <w:pStyle w:val="Heading1"/>
       </w:pPr>
-      <w:bookmarkStart w:id="21" w:name="_Toc232964874"/>
+      <w:bookmarkStart w:id="21" w:name="_Toc233006788"/>
       <w:r>
         <w:lastRenderedPageBreak/>
         <w:t>CHƯƠNG 4: TRIỂN KHAI (IMPLEMENTATION)</w:t>
@@ -7668,7 +7329,7 @@
       <w:pPr>
         <w:pStyle w:val="Heading2"/>
       </w:pPr>
-      <w:bookmarkStart w:id="22" w:name="_Toc232964875"/>
+      <w:bookmarkStart w:id="22" w:name="_Toc233006789"/>
       <w:r>
         <w:t>4.1. Cấu trúc dự án Backend</w:t>
       </w:r>
@@ -7841,7 +7502,7 @@
       <w:pPr>
         <w:pStyle w:val="Heading2"/>
       </w:pPr>
-      <w:bookmarkStart w:id="23" w:name="_Toc232964876"/>
+      <w:bookmarkStart w:id="23" w:name="_Toc233006790"/>
       <w:r>
         <w:t>4.2. Một số logic nghiệp vụ tiêu biểu</w:t>
       </w:r>
@@ -7851,7 +7512,7 @@
       <w:pPr>
         <w:pStyle w:val="Heading3"/>
       </w:pPr>
-      <w:bookmarkStart w:id="24" w:name="_Toc232964877"/>
+      <w:bookmarkStart w:id="24" w:name="_Toc233006791"/>
       <w:r>
         <w:t>4.2.1. Ràng buộc loại trừ lẫn nhau (mutual exclusivity)</w:t>
       </w:r>
@@ -7869,7 +7530,7 @@
       <w:pPr>
         <w:pStyle w:val="Heading3"/>
       </w:pPr>
-      <w:bookmarkStart w:id="25" w:name="_Toc232964878"/>
+      <w:bookmarkStart w:id="25" w:name="_Toc233006792"/>
       <w:r>
         <w:t>4.2.2. Hoàn tất Sprint (Complete Sprint)</w:t>
       </w:r>
@@ -7887,7 +7548,7 @@
       <w:pPr>
         <w:pStyle w:val="Heading3"/>
       </w:pPr>
-      <w:bookmarkStart w:id="26" w:name="_Toc232964879"/>
+      <w:bookmarkStart w:id="26" w:name="_Toc233006793"/>
       <w:r>
         <w:t>4.2.3. Validate vị trí của Work Item (Location)</w:t>
       </w:r>
@@ -7905,7 +7566,7 @@
       <w:pPr>
         <w:pStyle w:val="Heading2"/>
       </w:pPr>
-      <w:bookmarkStart w:id="27" w:name="_Toc232964880"/>
+      <w:bookmarkStart w:id="27" w:name="_Toc233006794"/>
       <w:r>
         <w:t>4.3. Cấu trúc dự án Frontend</w:t>
       </w:r>
@@ -8027,7 +7688,6 @@
           <w:sz w:val="18"/>
           <w:szCs w:val="18"/>
         </w:rPr>
-        <w:lastRenderedPageBreak/>
         <w:t>│   └── App.tsx / main.tsx</w:t>
       </w:r>
       <w:r>
@@ -8039,6 +7699,7 @@
           <w:sz w:val="18"/>
           <w:szCs w:val="18"/>
         </w:rPr>
+        <w:lastRenderedPageBreak/>
         <w:t>├── package.json</w:t>
       </w:r>
       <w:r>
@@ -8070,7 +7731,7 @@
       <w:pPr>
         <w:pStyle w:val="Heading1"/>
       </w:pPr>
-      <w:bookmarkStart w:id="28" w:name="_Toc232964881"/>
+      <w:bookmarkStart w:id="28" w:name="_Toc233006795"/>
       <w:r>
         <w:lastRenderedPageBreak/>
         <w:t>CHƯƠNG 5: KIỂM THỬ VÀ ĐÁNH GIÁ CHẤT LƯỢNG CODE</w:t>
@@ -8081,7 +7742,7 @@
       <w:pPr>
         <w:pStyle w:val="Heading2"/>
       </w:pPr>
-      <w:bookmarkStart w:id="29" w:name="_Toc232964882"/>
+      <w:bookmarkStart w:id="29" w:name="_Toc233006796"/>
       <w:r>
         <w:t>5.1. Unit test</w:t>
       </w:r>
@@ -8099,7 +7760,7 @@
       <w:pPr>
         <w:pStyle w:val="Heading2"/>
       </w:pPr>
-      <w:bookmarkStart w:id="30" w:name="_Toc232964883"/>
+      <w:bookmarkStart w:id="30" w:name="_Toc233006797"/>
       <w:r>
         <w:t>5.2. Kết quả review code tĩnh</w:t>
       </w:r>
@@ -8135,12 +7796,6 @@
         <w:gridCol w:w="8160"/>
       </w:tblGrid>
       <w:tr>
-        <w:tblPrEx>
-          <w:tblCellMar>
-            <w:top w:w="0" w:type="dxa"/>
-            <w:bottom w:w="0" w:type="dxa"/>
-          </w:tblCellMar>
-        </w:tblPrEx>
         <w:tc>
           <w:tcPr>
             <w:tcW w:w="1200" w:type="dxa"/>
@@ -8203,12 +7858,6 @@
         </w:tc>
       </w:tr>
       <w:tr>
-        <w:tblPrEx>
-          <w:tblCellMar>
-            <w:top w:w="0" w:type="dxa"/>
-            <w:bottom w:w="0" w:type="dxa"/>
-          </w:tblCellMar>
-        </w:tblPrEx>
         <w:tc>
           <w:tcPr>
             <w:tcW w:w="1200" w:type="dxa"/>
@@ -8265,12 +7914,6 @@
         </w:tc>
       </w:tr>
       <w:tr>
-        <w:tblPrEx>
-          <w:tblCellMar>
-            <w:top w:w="0" w:type="dxa"/>
-            <w:bottom w:w="0" w:type="dxa"/>
-          </w:tblCellMar>
-        </w:tblPrEx>
         <w:tc>
           <w:tcPr>
             <w:tcW w:w="1200" w:type="dxa"/>
@@ -8327,12 +7970,6 @@
         </w:tc>
       </w:tr>
       <w:tr>
-        <w:tblPrEx>
-          <w:tblCellMar>
-            <w:top w:w="0" w:type="dxa"/>
-            <w:bottom w:w="0" w:type="dxa"/>
-          </w:tblCellMar>
-        </w:tblPrEx>
         <w:tc>
           <w:tcPr>
             <w:tcW w:w="1200" w:type="dxa"/>
@@ -8389,12 +8026,6 @@
         </w:tc>
       </w:tr>
       <w:tr>
-        <w:tblPrEx>
-          <w:tblCellMar>
-            <w:top w:w="0" w:type="dxa"/>
-            <w:bottom w:w="0" w:type="dxa"/>
-          </w:tblCellMar>
-        </w:tblPrEx>
         <w:tc>
           <w:tcPr>
             <w:tcW w:w="1200" w:type="dxa"/>
@@ -8451,12 +8082,6 @@
         </w:tc>
       </w:tr>
       <w:tr>
-        <w:tblPrEx>
-          <w:tblCellMar>
-            <w:top w:w="0" w:type="dxa"/>
-            <w:bottom w:w="0" w:type="dxa"/>
-          </w:tblCellMar>
-        </w:tblPrEx>
         <w:tc>
           <w:tcPr>
             <w:tcW w:w="1200" w:type="dxa"/>
@@ -8517,7 +8142,7 @@
       <w:pPr>
         <w:pStyle w:val="Heading2"/>
       </w:pPr>
-      <w:bookmarkStart w:id="31" w:name="_Toc232964884"/>
+      <w:bookmarkStart w:id="31" w:name="_Toc233006798"/>
       <w:r>
         <w:t>5.3. Kiểm thử thực tế (chạy ứng dụng)</w:t>
       </w:r>
@@ -8686,8 +8311,9 @@
       <w:pPr>
         <w:pStyle w:val="Heading1"/>
       </w:pPr>
-      <w:bookmarkStart w:id="32" w:name="_Toc232964885"/>
-      <w:r>
+      <w:bookmarkStart w:id="32" w:name="_Toc233006799"/>
+      <w:r>
+        <w:lastRenderedPageBreak/>
         <w:t>CHƯƠNG 6: KẾT QUẢ ĐẠT ĐƯỢC</w:t>
       </w:r>
       <w:bookmarkEnd w:id="32"/>
@@ -8704,7 +8330,7 @@
       <w:pPr>
         <w:pStyle w:val="Heading2"/>
       </w:pPr>
-      <w:bookmarkStart w:id="33" w:name="_Toc232964886"/>
+      <w:bookmarkStart w:id="33" w:name="_Toc233006800"/>
       <w:r>
         <w:t>6.1. Trang Dashboard / Danh sách dự án</w:t>
       </w:r>
@@ -8776,7 +8402,7 @@
       <w:pPr>
         <w:pStyle w:val="Heading2"/>
       </w:pPr>
-      <w:bookmarkStart w:id="34" w:name="_Toc232964887"/>
+      <w:bookmarkStart w:id="34" w:name="_Toc233006801"/>
       <w:r>
         <w:t>6.2. Trang chi tiết dự án – Backlog</w:t>
       </w:r>
@@ -8915,8 +8541,16 @@
     <w:p>
       <w:pPr>
         <w:pStyle w:val="Heading2"/>
-      </w:pPr>
-      <w:bookmarkStart w:id="35" w:name="_Toc232964888"/>
+        <w:rPr>
+          <w:lang w:val="vi-VN"/>
+        </w:rPr>
+      </w:pPr>
+    </w:p>
+    <w:p>
+      <w:pPr>
+        <w:pStyle w:val="Heading2"/>
+      </w:pPr>
+      <w:bookmarkStart w:id="35" w:name="_Toc233006802"/>
       <w:r>
         <w:lastRenderedPageBreak/>
         <w:t>6.3. Quản lý Sprint</w:t>
@@ -8984,31 +8618,22 @@
           <w:lang w:val="vi-VN"/>
         </w:rPr>
       </w:pPr>
-      <w:bookmarkStart w:id="36" w:name="_Toc232964889"/>
+      <w:bookmarkStart w:id="36" w:name="_Toc233006803"/>
       <w:r>
         <w:t>6.4. Quản lý nguồn lực và chi phí</w:t>
       </w:r>
       <w:bookmarkEnd w:id="36"/>
     </w:p>
     <w:p>
-      <w:pPr>
-        <w:pStyle w:val="Heading2"/>
-        <w:rPr>
-          <w:lang w:val="vi-VN"/>
-        </w:rPr>
-      </w:pPr>
-      <w:bookmarkStart w:id="37" w:name="_Toc232964890"/>
       <w:r>
         <w:rPr>
           <w:noProof/>
-          <w:lang w:val="vi-VN"/>
         </w:rPr>
-        <w:lastRenderedPageBreak/>
         <w:drawing>
-          <wp:inline distT="0" distB="0" distL="0" distR="0" wp14:anchorId="4D06D73C" wp14:editId="2E2FD833">
+          <wp:inline distT="0" distB="0" distL="0" distR="0" wp14:anchorId="79A22E70" wp14:editId="76038A88">
             <wp:extent cx="5943600" cy="3714750"/>
             <wp:effectExtent l="0" t="0" r="0" b="6350"/>
-            <wp:docPr id="1486102370" name="Picture 9" descr="A screenshot of a computer&#10;&#10;Description automatically generated"/>
+            <wp:docPr id="1571782627" name="Picture 2" descr="A screenshot of a computer&#10;&#10;Description automatically generated"/>
             <wp:cNvGraphicFramePr>
               <a:graphicFrameLocks xmlns:a="http://schemas.openxmlformats.org/drawingml/2006/main" noChangeAspect="1"/>
             </wp:cNvGraphicFramePr>
@@ -9016,66 +8641,7 @@
               <a:graphicData uri="http://schemas.openxmlformats.org/drawingml/2006/picture">
                 <pic:pic xmlns:pic="http://schemas.openxmlformats.org/drawingml/2006/picture">
                   <pic:nvPicPr>
-                    <pic:cNvPr id="1486102370" name="Picture 9" descr="A screenshot of a computer&#10;&#10;Description automatically generated"/>
-                    <pic:cNvPicPr/>
-                  </pic:nvPicPr>
-                  <pic:blipFill>
-                    <a:blip r:embed="rId7" cstate="print">
-                      <a:extLst>
-                        <a:ext uri="{28A0092B-C50C-407E-A947-70E740481C1C}">
-                          <a14:useLocalDpi xmlns:a14="http://schemas.microsoft.com/office/drawing/2010/main" val="0"/>
-                        </a:ext>
-                      </a:extLst>
-                    </a:blip>
-                    <a:stretch>
-                      <a:fillRect/>
-                    </a:stretch>
-                  </pic:blipFill>
-                  <pic:spPr>
-                    <a:xfrm>
-                      <a:off x="0" y="0"/>
-                      <a:ext cx="5943600" cy="3714750"/>
-                    </a:xfrm>
-                    <a:prstGeom prst="rect">
-                      <a:avLst/>
-                    </a:prstGeom>
-                  </pic:spPr>
-                </pic:pic>
-              </a:graphicData>
-            </a:graphic>
-          </wp:inline>
-        </w:drawing>
-      </w:r>
-      <w:bookmarkEnd w:id="37"/>
-    </w:p>
-    <w:p>
-      <w:pPr>
-        <w:pStyle w:val="Heading2"/>
-      </w:pPr>
-      <w:bookmarkStart w:id="38" w:name="_Toc232964891"/>
-      <w:r>
-        <w:t>6.5. Timeline tổng quan</w:t>
-      </w:r>
-      <w:bookmarkEnd w:id="38"/>
-    </w:p>
-    <w:p>
-      <w:r>
-        <w:rPr>
-          <w:noProof/>
-        </w:rPr>
-        <w:drawing>
-          <wp:inline distT="0" distB="0" distL="0" distR="0" wp14:anchorId="610CA3F1" wp14:editId="5C75CC6A">
-            <wp:extent cx="5943600" cy="3714750"/>
-            <wp:effectExtent l="0" t="0" r="0" b="6350"/>
-            <wp:docPr id="1602951589" name="Picture 10" descr="A screenshot of a computer&#10;&#10;Description automatically generated"/>
-            <wp:cNvGraphicFramePr>
-              <a:graphicFrameLocks xmlns:a="http://schemas.openxmlformats.org/drawingml/2006/main" noChangeAspect="1"/>
-            </wp:cNvGraphicFramePr>
-            <a:graphic xmlns:a="http://schemas.openxmlformats.org/drawingml/2006/main">
-              <a:graphicData uri="http://schemas.openxmlformats.org/drawingml/2006/picture">
-                <pic:pic xmlns:pic="http://schemas.openxmlformats.org/drawingml/2006/picture">
-                  <pic:nvPicPr>
-                    <pic:cNvPr id="1602951589" name="Picture 10" descr="A screenshot of a computer&#10;&#10;Description automatically generated"/>
+                    <pic:cNvPr id="1571782627" name="Picture 2" descr="A screenshot of a computer&#10;&#10;Description automatically generated"/>
                     <pic:cNvPicPr/>
                   </pic:nvPicPr>
                   <pic:blipFill>
@@ -9105,6 +8671,76 @@
           </wp:inline>
         </w:drawing>
       </w:r>
+    </w:p>
+    <w:p>
+      <w:pPr>
+        <w:pStyle w:val="Heading2"/>
+        <w:rPr>
+          <w:lang w:val="vi-VN"/>
+        </w:rPr>
+      </w:pPr>
+      <w:bookmarkStart w:id="37" w:name="_Toc233006804"/>
+      <w:r>
+        <w:lastRenderedPageBreak/>
+        <w:t>6.5. Timeline tổng quan</w:t>
+      </w:r>
+      <w:bookmarkEnd w:id="37"/>
+    </w:p>
+    <w:p>
+      <w:pPr>
+        <w:pStyle w:val="Heading2"/>
+        <w:rPr>
+          <w:lang w:val="vi-VN"/>
+        </w:rPr>
+      </w:pPr>
+    </w:p>
+    <w:p>
+      <w:r>
+        <w:rPr>
+          <w:noProof/>
+        </w:rPr>
+        <w:drawing>
+          <wp:inline distT="0" distB="0" distL="0" distR="0" wp14:anchorId="610CA3F1" wp14:editId="5C75CC6A">
+            <wp:extent cx="5943600" cy="3714750"/>
+            <wp:effectExtent l="0" t="0" r="0" b="6350"/>
+            <wp:docPr id="1602951589" name="Picture 10" descr="A screenshot of a computer&#10;&#10;Description automatically generated"/>
+            <wp:cNvGraphicFramePr>
+              <a:graphicFrameLocks xmlns:a="http://schemas.openxmlformats.org/drawingml/2006/main" noChangeAspect="1"/>
+            </wp:cNvGraphicFramePr>
+            <a:graphic xmlns:a="http://schemas.openxmlformats.org/drawingml/2006/main">
+              <a:graphicData uri="http://schemas.openxmlformats.org/drawingml/2006/picture">
+                <pic:pic xmlns:pic="http://schemas.openxmlformats.org/drawingml/2006/picture">
+                  <pic:nvPicPr>
+                    <pic:cNvPr id="1602951589" name="Picture 10" descr="A screenshot of a computer&#10;&#10;Description automatically generated"/>
+                    <pic:cNvPicPr/>
+                  </pic:nvPicPr>
+                  <pic:blipFill>
+                    <a:blip r:embed="rId16" cstate="print">
+                      <a:extLst>
+                        <a:ext uri="{28A0092B-C50C-407E-A947-70E740481C1C}">
+                          <a14:useLocalDpi xmlns:a14="http://schemas.microsoft.com/office/drawing/2010/main" val="0"/>
+                        </a:ext>
+                      </a:extLst>
+                    </a:blip>
+                    <a:stretch>
+                      <a:fillRect/>
+                    </a:stretch>
+                  </pic:blipFill>
+                  <pic:spPr>
+                    <a:xfrm>
+                      <a:off x="0" y="0"/>
+                      <a:ext cx="5943600" cy="3714750"/>
+                    </a:xfrm>
+                    <a:prstGeom prst="rect">
+                      <a:avLst/>
+                    </a:prstGeom>
+                  </pic:spPr>
+                </pic:pic>
+              </a:graphicData>
+            </a:graphic>
+          </wp:inline>
+        </w:drawing>
+      </w:r>
       <w:r>
         <w:br w:type="page"/>
       </w:r>
@@ -9113,22 +8749,22 @@
       <w:pPr>
         <w:pStyle w:val="Heading1"/>
       </w:pPr>
-      <w:bookmarkStart w:id="39" w:name="_Toc232964892"/>
+      <w:bookmarkStart w:id="38" w:name="_Toc233006805"/>
       <w:r>
         <w:lastRenderedPageBreak/>
         <w:t>CHƯƠNG 7: HẠN CHẾ VÀ HƯỚNG PHÁT TRIỂN</w:t>
       </w:r>
+      <w:bookmarkEnd w:id="38"/>
+    </w:p>
+    <w:p>
+      <w:pPr>
+        <w:pStyle w:val="Heading2"/>
+      </w:pPr>
+      <w:bookmarkStart w:id="39" w:name="_Toc233006806"/>
+      <w:r>
+        <w:t>7.1. Hạn chế hiện tại</w:t>
+      </w:r>
       <w:bookmarkEnd w:id="39"/>
-    </w:p>
-    <w:p>
-      <w:pPr>
-        <w:pStyle w:val="Heading2"/>
-      </w:pPr>
-      <w:bookmarkStart w:id="40" w:name="_Toc232964893"/>
-      <w:r>
-        <w:t>7.1. Hạn chế hiện tại</w:t>
-      </w:r>
-      <w:bookmarkEnd w:id="40"/>
     </w:p>
     <w:p>
       <w:pPr>
@@ -9199,11 +8835,11 @@
       <w:pPr>
         <w:pStyle w:val="Heading2"/>
       </w:pPr>
-      <w:bookmarkStart w:id="41" w:name="_Toc232964894"/>
+      <w:bookmarkStart w:id="40" w:name="_Toc233006807"/>
       <w:r>
         <w:t>7.2. Hướng phát triển trong tương lai</w:t>
       </w:r>
-      <w:bookmarkEnd w:id="41"/>
+      <w:bookmarkEnd w:id="40"/>
     </w:p>
     <w:p>
       <w:pPr>
@@ -9292,12 +8928,12 @@
       <w:pPr>
         <w:pStyle w:val="Heading1"/>
       </w:pPr>
-      <w:bookmarkStart w:id="42" w:name="_Toc232964895"/>
+      <w:bookmarkStart w:id="41" w:name="_Toc233006808"/>
       <w:r>
         <w:lastRenderedPageBreak/>
         <w:t>KẾT LUẬN</w:t>
       </w:r>
-      <w:bookmarkEnd w:id="42"/>
+      <w:bookmarkEnd w:id="41"/>
     </w:p>
     <w:p>
       <w:pPr>
@@ -9324,12 +8960,12 @@
       <w:pPr>
         <w:pStyle w:val="Heading1"/>
       </w:pPr>
-      <w:bookmarkStart w:id="43" w:name="_Toc232964896"/>
+      <w:bookmarkStart w:id="42" w:name="_Toc233006809"/>
       <w:r>
         <w:lastRenderedPageBreak/>
         <w:t>TÀI LIỆU THAM KHẢO</w:t>
       </w:r>
-      <w:bookmarkEnd w:id="43"/>
+      <w:bookmarkEnd w:id="42"/>
     </w:p>
     <w:p>
       <w:pPr>
@@ -9423,10 +9059,10 @@
       </w:r>
     </w:p>
     <w:sectPr>
-      <w:headerReference w:type="default" r:id="rId16"/>
-      <w:footerReference w:type="default" r:id="rId17"/>
+      <w:headerReference w:type="default" r:id="rId17"/>
+      <w:footerReference w:type="default" r:id="rId18"/>
       <w:pgSz w:w="12240" w:h="15840"/>
-      <w:pgMar w:top="1440" w:right="1440" w:bottom="1440" w:left="1440" w:header="708" w:footer="708" w:gutter="0"/>
+      <w:pgMar w:top="1440" w:right="1440" w:bottom="871" w:left="1440" w:header="708" w:footer="708" w:gutter="0"/>
       <w:cols w:space="720"/>
       <w:docGrid w:linePitch="360"/>
     </w:sectPr>
@@ -10400,6 +10036,30 @@
       <w:ind w:left="440"/>
     </w:pPr>
   </w:style>
+  <w:style w:type="character" w:styleId="FollowedHyperlink">
+    <w:name w:val="FollowedHyperlink"/>
+    <w:basedOn w:val="DefaultParagraphFont"/>
+    <w:uiPriority w:val="99"/>
+    <w:semiHidden/>
+    <w:unhideWhenUsed/>
+    <w:rsid w:val="009053A5"/>
+    <w:rPr>
+      <w:color w:val="96607D" w:themeColor="followedHyperlink"/>
+      <w:u w:val="single"/>
+    </w:rPr>
+  </w:style>
+  <w:style w:type="character" w:styleId="UnresolvedMention">
+    <w:name w:val="Unresolved Mention"/>
+    <w:basedOn w:val="DefaultParagraphFont"/>
+    <w:uiPriority w:val="99"/>
+    <w:semiHidden/>
+    <w:unhideWhenUsed/>
+    <w:rsid w:val="00822E0C"/>
+    <w:rPr>
+      <w:color w:val="605E5C"/>
+      <w:shd w:val="clear" w:color="auto" w:fill="E1DFDD"/>
+    </w:rPr>
+  </w:style>
 </w:styles>
 </file>
 

</xml_diff>